<commit_message>
Upload clean source code, ignore Vivado/Vitis build files
</commit_message>
<xml_diff>
--- a/report/DDR MEMORY CONTROLLER.docx
+++ b/report/DDR MEMORY CONTROLLER.docx
@@ -1,6 +1,6 @@
 
 <file path=word/document.xml><?xml version="1.0" encoding="utf-8"?>
-<w:document xmlns:wpc="http://schemas.microsoft.com/office/word/2010/wordprocessingCanvas" xmlns:cx="http://schemas.microsoft.com/office/drawing/2014/chartex" xmlns:cx1="http://schemas.microsoft.com/office/drawing/2015/9/8/chartex" xmlns:cx2="http://schemas.microsoft.com/office/drawing/2015/10/21/chartex" xmlns:cx3="http://schemas.microsoft.com/office/drawing/2016/5/9/chartex" xmlns:cx4="http://schemas.microsoft.com/office/drawing/2016/5/10/chartex" xmlns:cx5="http://schemas.microsoft.com/office/drawing/2016/5/11/chartex" xmlns:cx6="http://schemas.microsoft.com/office/drawing/2016/5/12/chartex" xmlns:cx7="http://schemas.microsoft.com/office/drawing/2016/5/13/chartex" xmlns:cx8="http://schemas.microsoft.com/office/drawing/2016/5/14/chartex" xmlns:mc="http://schemas.openxmlformats.org/markup-compatibility/2006" xmlns:aink="http://schemas.microsoft.com/office/drawing/2016/ink" xmlns:am3d="http://schemas.microsoft.com/office/drawing/2017/model3d" xmlns:o="urn:schemas-microsoft-com:office:office" xmlns:oel="http://schemas.microsoft.com/office/2019/extlst" xmlns:r="http://schemas.openxmlformats.org/officeDocument/2006/relationships" xmlns:m="http://schemas.openxmlformats.org/officeDocument/2006/math" xmlns:v="urn:schemas-microsoft-com:vml" xmlns:wp14="http://schemas.microsoft.com/office/word/2010/wordprocessingDrawing" xmlns:wp="http://schemas.openxmlformats.org/drawingml/2006/wordprocessingDrawing" xmlns:w10="urn:schemas-microsoft-com:office:word" xmlns:w="http://schemas.openxmlformats.org/wordprocessingml/2006/main" xmlns:w14="http://schemas.microsoft.com/office/word/2010/wordml" xmlns:w15="http://schemas.microsoft.com/office/word/2012/wordml" xmlns:w16cex="http://schemas.microsoft.com/office/word/2018/wordml/cex" xmlns:w16cid="http://schemas.microsoft.com/office/word/2016/wordml/cid" xmlns:w16="http://schemas.microsoft.com/office/word/2018/wordml" xmlns:w16du="http://schemas.microsoft.com/office/word/2023/wordml/word16du" xmlns:w16sdtdh="http://schemas.microsoft.com/office/word/2020/wordml/sdtdatahash" xmlns:w16sdtfl="http://schemas.microsoft.com/office/word/2024/wordml/sdtformatlock" xmlns:w16se="http://schemas.microsoft.com/office/word/2015/wordml/symex" xmlns:wpg="http://schemas.microsoft.com/office/word/2010/wordprocessingGroup" xmlns:wpi="http://schemas.microsoft.com/office/word/2010/wordprocessingInk" xmlns:wne="http://schemas.microsoft.com/office/word/2006/wordml" xmlns:wps="http://schemas.microsoft.com/office/word/2010/wordprocessingShape" mc:Ignorable="w14 w15 w16se w16cid w16 w16cex w16sdtdh w16sdtfl w16du wp14">
+<w:document xmlns:wpc="http://schemas.microsoft.com/office/word/2010/wordprocessingCanvas" xmlns:cx="http://schemas.microsoft.com/office/drawing/2014/chartex" xmlns:cx1="http://schemas.microsoft.com/office/drawing/2015/9/8/chartex" xmlns:cx2="http://schemas.microsoft.com/office/drawing/2015/10/21/chartex" xmlns:cx3="http://schemas.microsoft.com/office/drawing/2016/5/9/chartex" xmlns:cx4="http://schemas.microsoft.com/office/drawing/2016/5/10/chartex" xmlns:cx5="http://schemas.microsoft.com/office/drawing/2016/5/11/chartex" xmlns:cx6="http://schemas.microsoft.com/office/drawing/2016/5/12/chartex" xmlns:cx7="http://schemas.microsoft.com/office/drawing/2016/5/13/chartex" xmlns:cx8="http://schemas.microsoft.com/office/drawing/2016/5/14/chartex" xmlns:mc="http://schemas.openxmlformats.org/markup-compatibility/2006" xmlns:aink="http://schemas.microsoft.com/office/drawing/2016/ink" xmlns:am3d="http://schemas.microsoft.com/office/drawing/2017/model3d" xmlns:o="urn:schemas-microsoft-com:office:office" xmlns:oel="http://schemas.microsoft.com/office/2019/extlst" xmlns:r="http://schemas.openxmlformats.org/officeDocument/2006/relationships" xmlns:m="http://schemas.openxmlformats.org/officeDocument/2006/math" xmlns:v="urn:schemas-microsoft-com:vml" xmlns:wp14="http://schemas.microsoft.com/office/word/2010/wordprocessingDrawing" xmlns:wp="http://schemas.openxmlformats.org/drawingml/2006/wordprocessingDrawing" xmlns:w10="urn:schemas-microsoft-com:office:word" xmlns:w="http://schemas.openxmlformats.org/wordprocessingml/2006/main" xmlns:w14="http://schemas.microsoft.com/office/word/2010/wordml" xmlns:w15="http://schemas.microsoft.com/office/word/2012/wordml" xmlns:w16cei="http://schemas.microsoft.com/office/word/2026/wordml/cei" xmlns:w16cex="http://schemas.microsoft.com/office/word/2018/wordml/cex" xmlns:w16cid="http://schemas.microsoft.com/office/word/2016/wordml/cid" xmlns:w16="http://schemas.microsoft.com/office/word/2018/wordml" xmlns:w16du="http://schemas.microsoft.com/office/word/2023/wordml/word16du" xmlns:w16sdtdh="http://schemas.microsoft.com/office/word/2020/wordml/sdtdatahash" xmlns:w16sdtfl="http://schemas.microsoft.com/office/word/2024/wordml/sdtformatlock" xmlns:w16se="http://schemas.microsoft.com/office/word/2015/wordml/symex" xmlns:wpg="http://schemas.microsoft.com/office/word/2010/wordprocessingGroup" xmlns:wpi="http://schemas.microsoft.com/office/word/2010/wordprocessingInk" xmlns:wne="http://schemas.microsoft.com/office/word/2006/wordml" xmlns:wps="http://schemas.microsoft.com/office/word/2010/wordprocessingShape" mc:Ignorable="w14 w15 w16se w16cid w16 w16cex w16sdtdh w16sdtfl w16du wp14">
   <w:body>
     <w:p>
       <w:pPr>
@@ -5461,25 +5461,38 @@
         <w:rPr>
           <w:rFonts w:ascii="Times New Roman" w:hAnsi="Times New Roman" w:cs="Times New Roman"/>
         </w:rPr>
+        <w:t>* Cấu hình khối AXI DMA ở chế độ Scatter-Gather (SG) để tự động nạp chuỗi các Descriptor mô tả vùng nhớ phân mảnh.</w:t>
+      </w:r>
+    </w:p>
+    <w:p>
+      <w:pPr>
+        <w:rPr>
+          <w:rFonts w:ascii="Times New Roman" w:hAnsi="Times New Roman" w:cs="Times New Roman"/>
+        </w:rPr>
+      </w:pPr>
+      <w:r>
+        <w:rPr>
+          <w:rFonts w:ascii="Times New Roman" w:hAnsi="Times New Roman" w:cs="Times New Roman"/>
+        </w:rPr>
         <w:t xml:space="preserve">* </w:t>
       </w:r>
       <w:r>
         <w:rPr>
           <w:rFonts w:ascii="Times New Roman" w:hAnsi="Times New Roman" w:cs="Times New Roman"/>
         </w:rPr>
-        <w:t>Cấu hình khối AXI DMA ở chế độ Scatter-Gather (SG)</w:t>
-      </w:r>
-      <w:r>
-        <w:rPr>
-          <w:rFonts w:ascii="Times New Roman" w:hAnsi="Times New Roman" w:cs="Times New Roman"/>
-        </w:rPr>
-        <w:t xml:space="preserve"> </w:t>
-      </w:r>
-      <w:r>
-        <w:rPr>
-          <w:rFonts w:ascii="Times New Roman" w:hAnsi="Times New Roman" w:cs="Times New Roman"/>
-        </w:rPr>
-        <w:t>để tự động nạp chuỗi các Descriptor mô tả vùng nhớ phân mảnh</w:t>
+        <w:t>Kích hoạt bộ quản lý bộ nhớ hệ thống SMMU (System MMU) Stage 1 Address Translation của Zynq MPSoC</w:t>
+      </w:r>
+      <w:r>
+        <w:rPr>
+          <w:rFonts w:ascii="Times New Roman" w:hAnsi="Times New Roman" w:cs="Times New Roman"/>
+        </w:rPr>
+        <w:t xml:space="preserve">. </w:t>
+      </w:r>
+      <w:r>
+        <w:rPr>
+          <w:rFonts w:ascii="Times New Roman" w:hAnsi="Times New Roman" w:cs="Times New Roman"/>
+        </w:rPr>
+        <w:t>SMMU sẽ tự động thực hiện ánh xạ địa chỉ ảo sang địa chỉ vật lý trực tiếp bằng phần cứng</w:t>
       </w:r>
       <w:r>
         <w:rPr>
@@ -5498,13 +5511,13 @@
         <w:rPr>
           <w:rFonts w:ascii="Times New Roman" w:hAnsi="Times New Roman" w:cs="Times New Roman"/>
         </w:rPr>
-        <w:t xml:space="preserve">* </w:t>
-      </w:r>
-      <w:r>
-        <w:rPr>
-          <w:rFonts w:ascii="Times New Roman" w:hAnsi="Times New Roman" w:cs="Times New Roman"/>
-        </w:rPr>
-        <w:t>Kích hoạt bộ quản lý bộ nhớ hệ thống SMMU (System MMU) Stage 1 Address Translation của Zynq MPSoC</w:t>
+        <w:t xml:space="preserve">+ Kết quả: </w:t>
+      </w:r>
+      <w:r>
+        <w:rPr>
+          <w:rFonts w:ascii="Times New Roman" w:hAnsi="Times New Roman" w:cs="Times New Roman"/>
+        </w:rPr>
+        <w:t>Loại bỏ hoàn toàn cơ chế bộ đệm trung gian (Bounce Buffer) bằng phần mềm</w:t>
       </w:r>
       <w:r>
         <w:rPr>
@@ -5516,7 +5529,7 @@
         <w:rPr>
           <w:rFonts w:ascii="Times New Roman" w:hAnsi="Times New Roman" w:cs="Times New Roman"/>
         </w:rPr>
-        <w:t>SMMU sẽ tự động thực hiện ánh xạ địa chỉ ảo sang địa chỉ vật lý trực tiếp bằng phần cứng</w:t>
+        <w:t>SG DMA có thể chủ động "thu gom" các ảnh EMNIST nằm rải rác trên RAM để tạo thành một luồng dữ liệu AXI-Stream liên tục tốc độ cao bơm trực tiếp vào PL thông qua cổng HP0 rộng 128-bit</w:t>
       </w:r>
       <w:r>
         <w:rPr>
@@ -5535,25 +5548,25 @@
         <w:rPr>
           <w:rFonts w:ascii="Times New Roman" w:hAnsi="Times New Roman" w:cs="Times New Roman"/>
         </w:rPr>
-        <w:t xml:space="preserve">+ Kết quả: </w:t>
-      </w:r>
-      <w:r>
-        <w:rPr>
-          <w:rFonts w:ascii="Times New Roman" w:hAnsi="Times New Roman" w:cs="Times New Roman"/>
-        </w:rPr>
-        <w:t>Loại bỏ hoàn toàn cơ chế bộ đệm trung gian (Bounce Buffer) bằng phần mềm</w:t>
-      </w:r>
-      <w:r>
-        <w:rPr>
-          <w:rFonts w:ascii="Times New Roman" w:hAnsi="Times New Roman" w:cs="Times New Roman"/>
-        </w:rPr>
-        <w:t xml:space="preserve">. </w:t>
-      </w:r>
-      <w:r>
-        <w:rPr>
-          <w:rFonts w:ascii="Times New Roman" w:hAnsi="Times New Roman" w:cs="Times New Roman"/>
-        </w:rPr>
-        <w:t>SG DMA có thể chủ động "thu gom" các ảnh EMNIST nằm rải rác trên RAM để tạo thành một luồng dữ liệu AXI-Stream liên tục tốc độ cao bơm trực tiếp vào PL thông qua cổng HP0 rộng 128-bit</w:t>
+        <w:t xml:space="preserve">- Vấn đề 4: </w:t>
+      </w:r>
+      <w:r>
+        <w:rPr>
+          <w:rFonts w:ascii="Times New Roman" w:hAnsi="Times New Roman" w:cs="Times New Roman"/>
+        </w:rPr>
+        <w:t>Sau khi Compute Engine nhận dạng xong ảnh và đưa ra kết quả phân loại (47 lớp)</w:t>
+      </w:r>
+      <w:r>
+        <w:rPr>
+          <w:rFonts w:ascii="Times New Roman" w:hAnsi="Times New Roman" w:cs="Times New Roman"/>
+        </w:rPr>
+        <w:t xml:space="preserve">, </w:t>
+      </w:r>
+      <w:r>
+        <w:rPr>
+          <w:rFonts w:ascii="Times New Roman" w:hAnsi="Times New Roman" w:cs="Times New Roman"/>
+        </w:rPr>
+        <w:t>CPU cần đọc kết quả này ngay lập tức. Nếu sử dụng các cổng truyền dữ liệu HP thông thường, CPU bắt buộc phải thực hiện thao tác xóa bộ đệm (cache flush/invalidate) bằng phần mềm rất chậm</w:t>
       </w:r>
       <w:r>
         <w:rPr>
@@ -5572,43 +5585,6 @@
         <w:rPr>
           <w:rFonts w:ascii="Times New Roman" w:hAnsi="Times New Roman" w:cs="Times New Roman"/>
         </w:rPr>
-        <w:t xml:space="preserve">- Vấn đề 4: </w:t>
-      </w:r>
-      <w:r>
-        <w:rPr>
-          <w:rFonts w:ascii="Times New Roman" w:hAnsi="Times New Roman" w:cs="Times New Roman"/>
-        </w:rPr>
-        <w:t>Sau khi Compute Engine nhận dạng xong ảnh và đưa ra kết quả phân loại (47 lớp)</w:t>
-      </w:r>
-      <w:r>
-        <w:rPr>
-          <w:rFonts w:ascii="Times New Roman" w:hAnsi="Times New Roman" w:cs="Times New Roman"/>
-        </w:rPr>
-        <w:t xml:space="preserve">, </w:t>
-      </w:r>
-      <w:r>
-        <w:rPr>
-          <w:rFonts w:ascii="Times New Roman" w:hAnsi="Times New Roman" w:cs="Times New Roman"/>
-        </w:rPr>
-        <w:t>CPU cần đọc kết quả này ngay lập tức. Nếu sử dụng các cổng truyền dữ liệu HP thông thường, CPU bắt buộc phải thực hiện thao tác xóa bộ đệm (cache flush/invalidate) bằng phần mềm rất chậm</w:t>
-      </w:r>
-      <w:r>
-        <w:rPr>
-          <w:rFonts w:ascii="Times New Roman" w:hAnsi="Times New Roman" w:cs="Times New Roman"/>
-        </w:rPr>
-        <w:t>.</w:t>
-      </w:r>
-    </w:p>
-    <w:p>
-      <w:pPr>
-        <w:rPr>
-          <w:rFonts w:ascii="Times New Roman" w:hAnsi="Times New Roman" w:cs="Times New Roman"/>
-        </w:rPr>
-      </w:pPr>
-      <w:r>
-        <w:rPr>
-          <w:rFonts w:ascii="Times New Roman" w:hAnsi="Times New Roman" w:cs="Times New Roman"/>
-        </w:rPr>
         <w:t>+ Giải pháp:</w:t>
       </w:r>
     </w:p>
@@ -5622,19 +5598,7 @@
         <w:rPr>
           <w:rFonts w:ascii="Times New Roman" w:hAnsi="Times New Roman" w:cs="Times New Roman"/>
         </w:rPr>
-        <w:t xml:space="preserve">* </w:t>
-      </w:r>
-      <w:r>
-        <w:rPr>
-          <w:rFonts w:ascii="Times New Roman" w:hAnsi="Times New Roman" w:cs="Times New Roman"/>
-        </w:rPr>
-        <w:t>Định tuyến luồng dữ liệu kết quả đầu ra từ PL đi qua cổng HPC (High-Performance Coherent) hoặc cổng ACP (Accelerator Coherency Port) kết nối trực tiếp với bộ liên kết nhất quán CCI-400 (Cache Coherent Interconnect)</w:t>
-      </w:r>
-      <w:r>
-        <w:rPr>
-          <w:rFonts w:ascii="Times New Roman" w:hAnsi="Times New Roman" w:cs="Times New Roman"/>
-        </w:rPr>
-        <w:t>.</w:t>
+        <w:t>* Định tuyến luồng dữ liệu kết quả đầu ra từ PL đi qua cổng HPC (High-Performance Coherent) hoặc cổng ACP (Accelerator Coherency Port) kết nối trực tiếp với bộ liên kết nhất quán CCI-400 (Cache Coherent Interconnect).</w:t>
       </w:r>
     </w:p>
     <w:p>
@@ -5958,13 +5922,7 @@
               <w:rPr>
                 <w:rFonts w:ascii="Times New Roman" w:hAnsi="Times New Roman" w:cs="Times New Roman"/>
               </w:rPr>
-              <w:t>Lưu trữ toàn bộ trọng số và bias của LeNet-5 cải tiến</w:t>
-            </w:r>
-            <w:r>
-              <w:rPr>
-                <w:rFonts w:ascii="Times New Roman" w:hAnsi="Times New Roman" w:cs="Times New Roman"/>
-              </w:rPr>
-              <w:t>.</w:t>
+              <w:t>Lưu trữ toàn bộ trọng số và bias của LeNet-5 cải tiến.</w:t>
             </w:r>
           </w:p>
         </w:tc>
@@ -5982,13 +5940,7 @@
               <w:rPr>
                 <w:rFonts w:ascii="Times New Roman" w:hAnsi="Times New Roman" w:cs="Times New Roman"/>
               </w:rPr>
-              <w:t>DDR-Free: Chỉ nạp một lần lúc khởi động, không đọc DDR ngoài khi chạy</w:t>
-            </w:r>
-            <w:r>
-              <w:rPr>
-                <w:rFonts w:ascii="Times New Roman" w:hAnsi="Times New Roman" w:cs="Times New Roman"/>
-              </w:rPr>
-              <w:t>.</w:t>
+              <w:t>DDR-Free: Chỉ nạp một lần lúc khởi động, không đọc DDR ngoài khi chạy.</w:t>
             </w:r>
           </w:p>
         </w:tc>
@@ -6087,13 +6039,7 @@
               <w:rPr>
                 <w:rFonts w:ascii="Times New Roman" w:hAnsi="Times New Roman" w:cs="Times New Roman"/>
               </w:rPr>
-              <w:t>Ping-Pong Buffer: Cho phép vừa đọc lớp</w:t>
-            </w:r>
-            <w:r>
-              <w:rPr>
-                <w:rFonts w:ascii="Times New Roman" w:hAnsi="Times New Roman" w:cs="Times New Roman"/>
-              </w:rPr>
-              <w:t xml:space="preserve"> N vừa ghi lớp N + 1 song song</w:t>
+              <w:t>Ping-Pong Buffer: Cho phép vừa đọc lớp N vừa ghi lớp N + 1 song song</w:t>
             </w:r>
           </w:p>
         </w:tc>
@@ -6174,13 +6120,7 @@
               <w:rPr>
                 <w:rFonts w:ascii="Times New Roman" w:hAnsi="Times New Roman" w:cs="Times New Roman"/>
               </w:rPr>
-              <w:t>Trích xuất cửa sổ trượt tích chập</w:t>
-            </w:r>
-            <w:r>
-              <w:rPr>
-                <w:rFonts w:ascii="Times New Roman" w:hAnsi="Times New Roman" w:cs="Times New Roman"/>
-              </w:rPr>
-              <w:t xml:space="preserve"> 3x3</w:t>
+              <w:t>Trích xuất cửa sổ trượt tích chập 3x3</w:t>
             </w:r>
           </w:p>
         </w:tc>
@@ -6198,13 +6138,7 @@
               <w:rPr>
                 <w:rFonts w:ascii="Times New Roman" w:hAnsi="Times New Roman" w:cs="Times New Roman"/>
               </w:rPr>
-              <w:t>Spatial Reuse: Một pixel đọc từ stream được tái sử dụng 9 lần cục bộ</w:t>
-            </w:r>
-            <w:r>
-              <w:rPr>
-                <w:rFonts w:ascii="Times New Roman" w:hAnsi="Times New Roman" w:cs="Times New Roman"/>
-              </w:rPr>
-              <w:t>.</w:t>
+              <w:t>Spatial Reuse: Một pixel đọc từ stream được tái sử dụng 9 lần cục bộ.</w:t>
             </w:r>
           </w:p>
         </w:tc>
@@ -6293,13 +6227,7 @@
               <w:rPr>
                 <w:rFonts w:ascii="Times New Roman" w:hAnsi="Times New Roman" w:cs="Times New Roman"/>
               </w:rPr>
-              <w:t>Vận chuyển ảnh EMNIST từ RAM vào lõi PL</w:t>
-            </w:r>
-            <w:r>
-              <w:rPr>
-                <w:rFonts w:ascii="Times New Roman" w:hAnsi="Times New Roman" w:cs="Times New Roman"/>
-              </w:rPr>
-              <w:t>.</w:t>
+              <w:t>Vận chuyển ảnh EMNIST từ RAM vào lõi PL.</w:t>
             </w:r>
           </w:p>
         </w:tc>
@@ -6329,6 +6257,2215 @@
           <w:rFonts w:ascii="Times New Roman" w:hAnsi="Times New Roman" w:cs="Times New Roman"/>
           <w:b/>
           <w:bCs/>
+        </w:rPr>
+      </w:pPr>
+      <w:r>
+        <w:rPr>
+          <w:rFonts w:ascii="Times New Roman" w:hAnsi="Times New Roman" w:cs="Times New Roman"/>
+          <w:b/>
+          <w:bCs/>
+        </w:rPr>
+        <w:t>Kiến trúc bộ nhớ:</w:t>
+      </w:r>
+    </w:p>
+    <w:p>
+      <w:pPr>
+        <w:rPr>
+          <w:rFonts w:ascii="Times New Roman" w:hAnsi="Times New Roman" w:cs="Times New Roman"/>
+          <w:b/>
+          <w:bCs/>
+        </w:rPr>
+      </w:pPr>
+      <w:r>
+        <w:rPr>
+          <w:rFonts w:ascii="Times New Roman" w:hAnsi="Times New Roman" w:cs="Times New Roman"/>
+          <w:b/>
+          <w:bCs/>
+          <w:noProof/>
+        </w:rPr>
+        <w:drawing>
+          <wp:inline distT="0" distB="0" distL="0" distR="0" wp14:anchorId="1507DA54" wp14:editId="436AF157">
+            <wp:extent cx="5943600" cy="2146300"/>
+            <wp:effectExtent l="0" t="0" r="0" b="6350"/>
+            <wp:docPr id="759555371" name="Picture 1"/>
+            <wp:cNvGraphicFramePr>
+              <a:graphicFrameLocks xmlns:a="http://schemas.openxmlformats.org/drawingml/2006/main" noChangeAspect="1"/>
+            </wp:cNvGraphicFramePr>
+            <a:graphic xmlns:a="http://schemas.openxmlformats.org/drawingml/2006/main">
+              <a:graphicData uri="http://schemas.openxmlformats.org/drawingml/2006/picture">
+                <pic:pic xmlns:pic="http://schemas.openxmlformats.org/drawingml/2006/picture">
+                  <pic:nvPicPr>
+                    <pic:cNvPr id="759555371" name="Picture 759555371"/>
+                    <pic:cNvPicPr/>
+                  </pic:nvPicPr>
+                  <pic:blipFill>
+                    <a:blip r:embed="rId7" cstate="print">
+                      <a:extLst>
+                        <a:ext uri="{28A0092B-C50C-407E-A947-70E740481C1C}">
+                          <a14:useLocalDpi xmlns:a14="http://schemas.microsoft.com/office/drawing/2010/main" val="0"/>
+                        </a:ext>
+                      </a:extLst>
+                    </a:blip>
+                    <a:stretch>
+                      <a:fillRect/>
+                    </a:stretch>
+                  </pic:blipFill>
+                  <pic:spPr>
+                    <a:xfrm>
+                      <a:off x="0" y="0"/>
+                      <a:ext cx="5943600" cy="2146300"/>
+                    </a:xfrm>
+                    <a:prstGeom prst="rect">
+                      <a:avLst/>
+                    </a:prstGeom>
+                  </pic:spPr>
+                </pic:pic>
+              </a:graphicData>
+            </a:graphic>
+          </wp:inline>
+        </w:drawing>
+      </w:r>
+    </w:p>
+    <w:p>
+      <w:pPr>
+        <w:rPr>
+          <w:rFonts w:ascii="Times New Roman" w:hAnsi="Times New Roman" w:cs="Times New Roman"/>
+          <w:b/>
+          <w:bCs/>
+        </w:rPr>
+      </w:pPr>
+      <w:r>
+        <w:rPr>
+          <w:rFonts w:ascii="Times New Roman" w:hAnsi="Times New Roman" w:cs="Times New Roman"/>
+          <w:b/>
+          <w:bCs/>
+        </w:rPr>
+        <w:lastRenderedPageBreak/>
+        <w:t>Thiết kế kiến trúc bộ nhớ trên VIVADO:</w:t>
+      </w:r>
+    </w:p>
+    <w:p>
+      <w:pPr>
+        <w:rPr>
+          <w:rFonts w:ascii="Times New Roman" w:hAnsi="Times New Roman" w:cs="Times New Roman"/>
+          <w:b/>
+          <w:bCs/>
+        </w:rPr>
+      </w:pPr>
+      <w:r>
+        <w:rPr>
+          <w:rFonts w:ascii="Times New Roman" w:hAnsi="Times New Roman" w:cs="Times New Roman"/>
+          <w:b/>
+          <w:bCs/>
+        </w:rPr>
+        <w:drawing>
+          <wp:inline distT="0" distB="0" distL="0" distR="0" wp14:anchorId="5E9EA4F1" wp14:editId="47AFFF55">
+            <wp:extent cx="5943600" cy="3185160"/>
+            <wp:effectExtent l="0" t="0" r="0" b="0"/>
+            <wp:docPr id="407518774" name="Picture 1"/>
+            <wp:cNvGraphicFramePr>
+              <a:graphicFrameLocks xmlns:a="http://schemas.openxmlformats.org/drawingml/2006/main" noChangeAspect="1"/>
+            </wp:cNvGraphicFramePr>
+            <a:graphic xmlns:a="http://schemas.openxmlformats.org/drawingml/2006/main">
+              <a:graphicData uri="http://schemas.openxmlformats.org/drawingml/2006/picture">
+                <pic:pic xmlns:pic="http://schemas.openxmlformats.org/drawingml/2006/picture">
+                  <pic:nvPicPr>
+                    <pic:cNvPr id="407518774" name=""/>
+                    <pic:cNvPicPr/>
+                  </pic:nvPicPr>
+                  <pic:blipFill>
+                    <a:blip r:embed="rId8"/>
+                    <a:stretch>
+                      <a:fillRect/>
+                    </a:stretch>
+                  </pic:blipFill>
+                  <pic:spPr>
+                    <a:xfrm>
+                      <a:off x="0" y="0"/>
+                      <a:ext cx="5943600" cy="3185160"/>
+                    </a:xfrm>
+                    <a:prstGeom prst="rect">
+                      <a:avLst/>
+                    </a:prstGeom>
+                  </pic:spPr>
+                </pic:pic>
+              </a:graphicData>
+            </a:graphic>
+          </wp:inline>
+        </w:drawing>
+      </w:r>
+    </w:p>
+    <w:p>
+      <w:pPr>
+        <w:rPr>
+          <w:rFonts w:ascii="Times New Roman" w:hAnsi="Times New Roman" w:cs="Times New Roman"/>
+          <w:b/>
+          <w:bCs/>
+        </w:rPr>
+      </w:pPr>
+      <w:r>
+        <w:rPr>
+          <w:rFonts w:ascii="Times New Roman" w:hAnsi="Times New Roman" w:cs="Times New Roman"/>
+          <w:b/>
+          <w:bCs/>
+        </w:rPr>
+        <w:t>Synthesis:</w:t>
+      </w:r>
+    </w:p>
+    <w:p>
+      <w:pPr>
+        <w:rPr>
+          <w:rFonts w:ascii="Times New Roman" w:hAnsi="Times New Roman" w:cs="Times New Roman"/>
+        </w:rPr>
+      </w:pPr>
+      <w:r>
+        <w:rPr>
+          <w:rFonts w:ascii="Times New Roman" w:hAnsi="Times New Roman" w:cs="Times New Roman"/>
+        </w:rPr>
+        <w:drawing>
+          <wp:inline distT="0" distB="0" distL="0" distR="0" wp14:anchorId="2AA3BBC9" wp14:editId="64D9101B">
+            <wp:extent cx="5943600" cy="1892935"/>
+            <wp:effectExtent l="0" t="0" r="0" b="0"/>
+            <wp:docPr id="810816621" name="Picture 1"/>
+            <wp:cNvGraphicFramePr>
+              <a:graphicFrameLocks xmlns:a="http://schemas.openxmlformats.org/drawingml/2006/main" noChangeAspect="1"/>
+            </wp:cNvGraphicFramePr>
+            <a:graphic xmlns:a="http://schemas.openxmlformats.org/drawingml/2006/main">
+              <a:graphicData uri="http://schemas.openxmlformats.org/drawingml/2006/picture">
+                <pic:pic xmlns:pic="http://schemas.openxmlformats.org/drawingml/2006/picture">
+                  <pic:nvPicPr>
+                    <pic:cNvPr id="810816621" name=""/>
+                    <pic:cNvPicPr/>
+                  </pic:nvPicPr>
+                  <pic:blipFill>
+                    <a:blip r:embed="rId9"/>
+                    <a:stretch>
+                      <a:fillRect/>
+                    </a:stretch>
+                  </pic:blipFill>
+                  <pic:spPr>
+                    <a:xfrm>
+                      <a:off x="0" y="0"/>
+                      <a:ext cx="5943600" cy="1892935"/>
+                    </a:xfrm>
+                    <a:prstGeom prst="rect">
+                      <a:avLst/>
+                    </a:prstGeom>
+                  </pic:spPr>
+                </pic:pic>
+              </a:graphicData>
+            </a:graphic>
+          </wp:inline>
+        </w:drawing>
+      </w:r>
+    </w:p>
+    <w:p>
+      <w:pPr>
+        <w:rPr>
+          <w:rFonts w:ascii="Times New Roman" w:hAnsi="Times New Roman" w:cs="Times New Roman"/>
+        </w:rPr>
+      </w:pPr>
+      <w:r>
+        <w:rPr>
+          <w:rFonts w:ascii="Times New Roman" w:hAnsi="Times New Roman" w:cs="Times New Roman"/>
+        </w:rPr>
+        <w:drawing>
+          <wp:inline distT="0" distB="0" distL="0" distR="0" wp14:anchorId="731B2F55" wp14:editId="0A7BDFDF">
+            <wp:extent cx="5943600" cy="1958340"/>
+            <wp:effectExtent l="0" t="0" r="0" b="3810"/>
+            <wp:docPr id="474914021" name="Picture 1"/>
+            <wp:cNvGraphicFramePr>
+              <a:graphicFrameLocks xmlns:a="http://schemas.openxmlformats.org/drawingml/2006/main" noChangeAspect="1"/>
+            </wp:cNvGraphicFramePr>
+            <a:graphic xmlns:a="http://schemas.openxmlformats.org/drawingml/2006/main">
+              <a:graphicData uri="http://schemas.openxmlformats.org/drawingml/2006/picture">
+                <pic:pic xmlns:pic="http://schemas.openxmlformats.org/drawingml/2006/picture">
+                  <pic:nvPicPr>
+                    <pic:cNvPr id="474914021" name=""/>
+                    <pic:cNvPicPr/>
+                  </pic:nvPicPr>
+                  <pic:blipFill>
+                    <a:blip r:embed="rId10"/>
+                    <a:stretch>
+                      <a:fillRect/>
+                    </a:stretch>
+                  </pic:blipFill>
+                  <pic:spPr>
+                    <a:xfrm>
+                      <a:off x="0" y="0"/>
+                      <a:ext cx="5943600" cy="1958340"/>
+                    </a:xfrm>
+                    <a:prstGeom prst="rect">
+                      <a:avLst/>
+                    </a:prstGeom>
+                  </pic:spPr>
+                </pic:pic>
+              </a:graphicData>
+            </a:graphic>
+          </wp:inline>
+        </w:drawing>
+      </w:r>
+    </w:p>
+    <w:p>
+      <w:pPr>
+        <w:rPr>
+          <w:rFonts w:ascii="Times New Roman" w:hAnsi="Times New Roman" w:cs="Times New Roman"/>
+        </w:rPr>
+      </w:pPr>
+      <w:r>
+        <w:rPr>
+          <w:rFonts w:ascii="Times New Roman" w:hAnsi="Times New Roman" w:cs="Times New Roman"/>
+        </w:rPr>
+        <w:lastRenderedPageBreak/>
+        <w:t xml:space="preserve">- Về logic: Lõi </w:t>
+      </w:r>
+      <w:r>
+        <w:rPr>
+          <w:rFonts w:ascii="Times New Roman" w:hAnsi="Times New Roman" w:cs="Times New Roman"/>
+        </w:rPr>
+        <w:t>axis_cnn_mnist_emnist tiêu tốn 1235 LUT</w:t>
+      </w:r>
+      <w:r>
+        <w:rPr>
+          <w:rFonts w:ascii="Times New Roman" w:hAnsi="Times New Roman" w:cs="Times New Roman"/>
+        </w:rPr>
+        <w:t xml:space="preserve">. </w:t>
+      </w:r>
+      <w:r>
+        <w:rPr>
+          <w:rFonts w:ascii="Times New Roman" w:hAnsi="Times New Roman" w:cs="Times New Roman"/>
+        </w:rPr>
+        <w:t>Trong đó, khối Fully Connected</w:t>
+      </w:r>
+      <w:r>
+        <w:rPr>
+          <w:rFonts w:ascii="Times New Roman" w:hAnsi="Times New Roman" w:cs="Times New Roman"/>
+        </w:rPr>
+        <w:t xml:space="preserve"> tốn </w:t>
+      </w:r>
+      <w:r>
+        <w:rPr>
+          <w:rFonts w:ascii="Times New Roman" w:hAnsi="Times New Roman" w:cs="Times New Roman"/>
+        </w:rPr>
+        <w:t>nhiều nhất với 780 LUT. Các lớp Conv và Pool chiếm rất ít (khoảng hơn 100 LUT mỗi lớp)</w:t>
+      </w:r>
+      <w:r>
+        <w:rPr>
+          <w:rFonts w:ascii="Times New Roman" w:hAnsi="Times New Roman" w:cs="Times New Roman"/>
+        </w:rPr>
+        <w:t>.</w:t>
+      </w:r>
+    </w:p>
+    <w:p>
+      <w:pPr>
+        <w:rPr>
+          <w:rFonts w:ascii="Times New Roman" w:hAnsi="Times New Roman" w:cs="Times New Roman"/>
+        </w:rPr>
+      </w:pPr>
+      <w:r>
+        <w:rPr>
+          <w:rFonts w:ascii="Times New Roman" w:hAnsi="Times New Roman" w:cs="Times New Roman"/>
+        </w:rPr>
+        <w:t xml:space="preserve">- Về thanh ghi: </w:t>
+      </w:r>
+      <w:r>
+        <w:rPr>
+          <w:rFonts w:ascii="Times New Roman" w:hAnsi="Times New Roman" w:cs="Times New Roman"/>
+        </w:rPr>
+        <w:t>Khối CNN sử dụng tổng cộng 2059 FF. Lại một lần nữa, khối</w:t>
+      </w:r>
+      <w:r>
+        <w:rPr>
+          <w:rFonts w:ascii="Times New Roman" w:hAnsi="Times New Roman" w:cs="Times New Roman"/>
+        </w:rPr>
+        <w:t xml:space="preserve"> u_fc </w:t>
+      </w:r>
+      <w:r>
+        <w:rPr>
+          <w:rFonts w:ascii="Times New Roman" w:hAnsi="Times New Roman" w:cs="Times New Roman"/>
+        </w:rPr>
+        <w:t>chiếm áp đảo với 1654 FF</w:t>
+      </w:r>
+      <w:r>
+        <w:rPr>
+          <w:rFonts w:ascii="Times New Roman" w:hAnsi="Times New Roman" w:cs="Times New Roman"/>
+        </w:rPr>
+        <w:t>.</w:t>
+      </w:r>
+    </w:p>
+    <w:p>
+      <w:pPr>
+        <w:rPr>
+          <w:rFonts w:ascii="Times New Roman" w:hAnsi="Times New Roman" w:cs="Times New Roman"/>
+        </w:rPr>
+      </w:pPr>
+      <w:r>
+        <w:rPr>
+          <w:rFonts w:ascii="Times New Roman" w:hAnsi="Times New Roman" w:cs="Times New Roman"/>
+        </w:rPr>
+        <w:t xml:space="preserve">- Lý do </w:t>
+      </w:r>
+      <w:r>
+        <w:rPr>
+          <w:rFonts w:ascii="Times New Roman" w:hAnsi="Times New Roman" w:cs="Times New Roman"/>
+        </w:rPr>
+        <w:t>mảng dữ liệu</w:t>
+      </w:r>
+      <w:r>
+        <w:rPr>
+          <w:rFonts w:ascii="Times New Roman" w:hAnsi="Times New Roman" w:cs="Times New Roman"/>
+        </w:rPr>
+        <w:t xml:space="preserve"> </w:t>
+      </w:r>
+      <w:r>
+        <w:rPr>
+          <w:rFonts w:ascii="Times New Roman" w:hAnsi="Times New Roman" w:cs="Times New Roman"/>
+        </w:rPr>
+        <w:t>không nằm trong BRAM mà lại thành Flip-Flop</w:t>
+      </w:r>
+      <w:r>
+        <w:rPr>
+          <w:rFonts w:ascii="Times New Roman" w:hAnsi="Times New Roman" w:cs="Times New Roman"/>
+        </w:rPr>
+        <w:t>:</w:t>
+      </w:r>
+    </w:p>
+    <w:p>
+      <w:pPr>
+        <w:rPr>
+          <w:rFonts w:ascii="Times New Roman" w:hAnsi="Times New Roman" w:cs="Times New Roman"/>
+        </w:rPr>
+      </w:pPr>
+      <w:r>
+        <w:rPr>
+          <w:rFonts w:ascii="Times New Roman" w:hAnsi="Times New Roman" w:cs="Times New Roman"/>
+        </w:rPr>
+        <w:t xml:space="preserve">+ Do </w:t>
+      </w:r>
+      <w:r>
+        <w:rPr>
+          <w:rFonts w:ascii="Times New Roman" w:hAnsi="Times New Roman" w:cs="Times New Roman"/>
+        </w:rPr>
+        <w:t>đặc thù cấu trúc code</w:t>
+      </w:r>
+      <w:r>
+        <w:rPr>
+          <w:rFonts w:ascii="Times New Roman" w:hAnsi="Times New Roman" w:cs="Times New Roman"/>
+        </w:rPr>
+        <w:t xml:space="preserve">: </w:t>
+      </w:r>
+      <w:r>
+        <w:rPr>
+          <w:rFonts w:ascii="Times New Roman" w:hAnsi="Times New Roman" w:cs="Times New Roman"/>
+        </w:rPr>
+        <w:t>Trong thiết kế RTL</w:t>
+      </w:r>
+      <w:r>
+        <w:rPr>
+          <w:rFonts w:ascii="Times New Roman" w:hAnsi="Times New Roman" w:cs="Times New Roman"/>
+        </w:rPr>
+        <w:t xml:space="preserve">, nhóm dùng nhiều các mảng </w:t>
+      </w:r>
+      <w:r>
+        <w:rPr>
+          <w:rFonts w:ascii="Times New Roman" w:hAnsi="Times New Roman" w:cs="Times New Roman"/>
+        </w:rPr>
+        <w:t>và cho phép truy xuất/đọc dữ liệu một cách trực tiếp mà không cần đợi sườn lên của xung nhịp</w:t>
+      </w:r>
+      <w:r>
+        <w:rPr>
+          <w:rFonts w:ascii="Times New Roman" w:hAnsi="Times New Roman" w:cs="Times New Roman"/>
+        </w:rPr>
+        <w:t xml:space="preserve"> </w:t>
+      </w:r>
+      <w:r>
+        <w:rPr>
+          <w:rFonts w:ascii="Times New Roman" w:hAnsi="Times New Roman" w:cs="Times New Roman"/>
+        </w:rPr>
+        <w:t>(Asynchronous Read)</w:t>
+      </w:r>
+      <w:r>
+        <w:rPr>
+          <w:rFonts w:ascii="Times New Roman" w:hAnsi="Times New Roman" w:cs="Times New Roman"/>
+        </w:rPr>
+        <w:t xml:space="preserve">. </w:t>
+      </w:r>
+      <w:r>
+        <w:rPr>
+          <w:rFonts w:ascii="Times New Roman" w:hAnsi="Times New Roman" w:cs="Times New Roman"/>
+        </w:rPr>
+        <w:t>Vì BRAM vật lý của chip Zynq bắt buộc phải đọc đồng bộ (Synchronous Read), Vivado không thể ép mảng đó vào BRAM được</w:t>
+      </w:r>
+      <w:r>
+        <w:rPr>
+          <w:rFonts w:ascii="Times New Roman" w:hAnsi="Times New Roman" w:cs="Times New Roman"/>
+        </w:rPr>
+        <w:t>.</w:t>
+      </w:r>
+    </w:p>
+    <w:p>
+      <w:pPr>
+        <w:rPr>
+          <w:rFonts w:ascii="Times New Roman" w:hAnsi="Times New Roman" w:cs="Times New Roman"/>
+        </w:rPr>
+      </w:pPr>
+      <w:r>
+        <w:rPr>
+          <w:rFonts w:ascii="Times New Roman" w:hAnsi="Times New Roman" w:cs="Times New Roman"/>
+        </w:rPr>
+        <w:t xml:space="preserve">+ </w:t>
+      </w:r>
+      <w:r>
+        <w:rPr>
+          <w:rFonts w:ascii="Times New Roman" w:hAnsi="Times New Roman" w:cs="Times New Roman"/>
+        </w:rPr>
+        <w:t>Để đảm bảo mạch vẫn chạy đúng logic</w:t>
+      </w:r>
+      <w:r>
+        <w:rPr>
+          <w:rFonts w:ascii="Times New Roman" w:hAnsi="Times New Roman" w:cs="Times New Roman"/>
+        </w:rPr>
+        <w:t xml:space="preserve">, </w:t>
+      </w:r>
+      <w:r>
+        <w:rPr>
+          <w:rFonts w:ascii="Times New Roman" w:hAnsi="Times New Roman" w:cs="Times New Roman"/>
+        </w:rPr>
+        <w:t>phần mềm đã tự động lấy hàng nghìn thanh ghi (Flip-Flop) để làm ô nhớ lưu dữ liệu, và dùng hàng trăm cổng LUT để làm bộ Multiplexer (bộ chọn kênh) định tuyến đường truyền dữ liệu ra ngoài</w:t>
+      </w:r>
+      <w:r>
+        <w:rPr>
+          <w:rFonts w:ascii="Times New Roman" w:hAnsi="Times New Roman" w:cs="Times New Roman"/>
+        </w:rPr>
+        <w:t>.</w:t>
+      </w:r>
+    </w:p>
+    <w:p>
+      <w:pPr>
+        <w:rPr>
+          <w:rFonts w:ascii="Times New Roman" w:hAnsi="Times New Roman" w:cs="Times New Roman"/>
+        </w:rPr>
+      </w:pPr>
+      <w:r>
+        <w:rPr>
+          <w:rFonts w:ascii="Times New Roman" w:hAnsi="Times New Roman" w:cs="Times New Roman"/>
+        </w:rPr>
+        <w:t>- Ưu, nhược điểm:</w:t>
+      </w:r>
+    </w:p>
+    <w:p>
+      <w:pPr>
+        <w:rPr>
+          <w:rFonts w:ascii="Times New Roman" w:hAnsi="Times New Roman" w:cs="Times New Roman"/>
+        </w:rPr>
+      </w:pPr>
+      <w:r>
+        <w:rPr>
+          <w:rFonts w:ascii="Times New Roman" w:hAnsi="Times New Roman" w:cs="Times New Roman"/>
+        </w:rPr>
+        <w:t xml:space="preserve">+ Ưu điểm: </w:t>
+      </w:r>
+      <w:r>
+        <w:rPr>
+          <w:rFonts w:ascii="Times New Roman" w:hAnsi="Times New Roman" w:cs="Times New Roman"/>
+        </w:rPr>
+        <w:t>Việc biến bộ nhớ thành LUT và FF mang lại tốc độ truy xuất siêu tốc (gần như độ trễ bằng 0 ở khâu đọc) và băng thông cực lớn</w:t>
+      </w:r>
+      <w:r>
+        <w:rPr>
+          <w:rFonts w:ascii="Times New Roman" w:hAnsi="Times New Roman" w:cs="Times New Roman"/>
+        </w:rPr>
+        <w:t xml:space="preserve">. Khối u_fc </w:t>
+      </w:r>
+      <w:r>
+        <w:rPr>
+          <w:rFonts w:ascii="Times New Roman" w:hAnsi="Times New Roman" w:cs="Times New Roman"/>
+        </w:rPr>
+        <w:t>có thể tính toán rất nhanh vì dữ liệu nằm ngay sát các cổng logic</w:t>
+      </w:r>
+      <w:r>
+        <w:rPr>
+          <w:rFonts w:ascii="Times New Roman" w:hAnsi="Times New Roman" w:cs="Times New Roman"/>
+        </w:rPr>
+        <w:t>.</w:t>
+      </w:r>
+    </w:p>
+    <w:p>
+      <w:pPr>
+        <w:rPr>
+          <w:rFonts w:ascii="Times New Roman" w:hAnsi="Times New Roman" w:cs="Times New Roman"/>
+        </w:rPr>
+      </w:pPr>
+      <w:r>
+        <w:rPr>
+          <w:rFonts w:ascii="Times New Roman" w:hAnsi="Times New Roman" w:cs="Times New Roman"/>
+        </w:rPr>
+        <w:t xml:space="preserve">+ Nhược điểm: </w:t>
+      </w:r>
+      <w:r>
+        <w:rPr>
+          <w:rFonts w:ascii="Times New Roman" w:hAnsi="Times New Roman" w:cs="Times New Roman"/>
+        </w:rPr>
+        <w:t>Cách làm này cực kỳ tốn diện tích logic. Với mạng LeNet-5 nhỏ gọn như hiện tại, chip Zynq</w:t>
+      </w:r>
+      <w:r>
+        <w:rPr>
+          <w:rFonts w:ascii="Times New Roman" w:hAnsi="Times New Roman" w:cs="Times New Roman"/>
+        </w:rPr>
+        <w:t xml:space="preserve"> </w:t>
+      </w:r>
+      <w:r>
+        <w:rPr>
+          <w:rFonts w:ascii="Times New Roman" w:hAnsi="Times New Roman" w:cs="Times New Roman"/>
+        </w:rPr>
+        <w:t>vẫn dư sức gánh (chỉ chiếm 3-4% tài nguyên)</w:t>
+      </w:r>
+      <w:r>
+        <w:rPr>
+          <w:rFonts w:ascii="Times New Roman" w:hAnsi="Times New Roman" w:cs="Times New Roman"/>
+        </w:rPr>
+        <w:t xml:space="preserve">. </w:t>
+      </w:r>
+      <w:r>
+        <w:rPr>
+          <w:rFonts w:ascii="Times New Roman" w:hAnsi="Times New Roman" w:cs="Times New Roman"/>
+        </w:rPr>
+        <w:t>Nhưng nếu mở rộng lên các mạng lớn hơn như VGG-16, chip sẽ cạn kiệt LUT/FF ngay lập tức</w:t>
+      </w:r>
+      <w:r>
+        <w:rPr>
+          <w:rFonts w:ascii="Times New Roman" w:hAnsi="Times New Roman" w:cs="Times New Roman"/>
+        </w:rPr>
+        <w:t>.</w:t>
+      </w:r>
+    </w:p>
+    <w:p>
+      <w:pPr>
+        <w:rPr>
+          <w:rFonts w:ascii="Times New Roman" w:hAnsi="Times New Roman" w:cs="Times New Roman"/>
+          <w:b/>
+          <w:bCs/>
+        </w:rPr>
+      </w:pPr>
+      <w:r>
+        <w:rPr>
+          <w:rFonts w:ascii="Times New Roman" w:hAnsi="Times New Roman" w:cs="Times New Roman"/>
+          <w:b/>
+          <w:bCs/>
+        </w:rPr>
+        <w:t>Implement:</w:t>
+      </w:r>
+    </w:p>
+    <w:p>
+      <w:pPr>
+        <w:rPr>
+          <w:rFonts w:ascii="Times New Roman" w:hAnsi="Times New Roman" w:cs="Times New Roman"/>
+        </w:rPr>
+      </w:pPr>
+      <w:r>
+        <w:rPr>
+          <w:rFonts w:ascii="Times New Roman" w:hAnsi="Times New Roman" w:cs="Times New Roman"/>
+        </w:rPr>
+        <w:t>- Device view:</w:t>
+      </w:r>
+    </w:p>
+    <w:p>
+      <w:pPr>
+        <w:rPr>
+          <w:rFonts w:ascii="Times New Roman" w:hAnsi="Times New Roman" w:cs="Times New Roman"/>
+        </w:rPr>
+      </w:pPr>
+      <w:r>
+        <w:rPr>
+          <w:rFonts w:ascii="Times New Roman" w:hAnsi="Times New Roman" w:cs="Times New Roman"/>
+        </w:rPr>
+        <w:drawing>
+          <wp:inline distT="0" distB="0" distL="0" distR="0" wp14:anchorId="6C854208" wp14:editId="41628A76">
+            <wp:extent cx="5943600" cy="2418715"/>
+            <wp:effectExtent l="0" t="0" r="0" b="635"/>
+            <wp:docPr id="484262774" name="Picture 1"/>
+            <wp:cNvGraphicFramePr>
+              <a:graphicFrameLocks xmlns:a="http://schemas.openxmlformats.org/drawingml/2006/main" noChangeAspect="1"/>
+            </wp:cNvGraphicFramePr>
+            <a:graphic xmlns:a="http://schemas.openxmlformats.org/drawingml/2006/main">
+              <a:graphicData uri="http://schemas.openxmlformats.org/drawingml/2006/picture">
+                <pic:pic xmlns:pic="http://schemas.openxmlformats.org/drawingml/2006/picture">
+                  <pic:nvPicPr>
+                    <pic:cNvPr id="484262774" name=""/>
+                    <pic:cNvPicPr/>
+                  </pic:nvPicPr>
+                  <pic:blipFill>
+                    <a:blip r:embed="rId11"/>
+                    <a:stretch>
+                      <a:fillRect/>
+                    </a:stretch>
+                  </pic:blipFill>
+                  <pic:spPr>
+                    <a:xfrm>
+                      <a:off x="0" y="0"/>
+                      <a:ext cx="5943600" cy="2418715"/>
+                    </a:xfrm>
+                    <a:prstGeom prst="rect">
+                      <a:avLst/>
+                    </a:prstGeom>
+                  </pic:spPr>
+                </pic:pic>
+              </a:graphicData>
+            </a:graphic>
+          </wp:inline>
+        </w:drawing>
+      </w:r>
+    </w:p>
+    <w:p>
+      <w:pPr>
+        <w:rPr>
+          <w:rFonts w:ascii="Times New Roman" w:hAnsi="Times New Roman" w:cs="Times New Roman"/>
+        </w:rPr>
+      </w:pPr>
+      <w:r>
+        <w:rPr>
+          <w:rFonts w:ascii="Times New Roman" w:hAnsi="Times New Roman" w:cs="Times New Roman"/>
+        </w:rPr>
+        <w:lastRenderedPageBreak/>
+        <w:t>+ Đây</w:t>
+      </w:r>
+      <w:r>
+        <w:rPr>
+          <w:rFonts w:ascii="Times New Roman" w:hAnsi="Times New Roman" w:cs="Times New Roman"/>
+        </w:rPr>
+        <w:t xml:space="preserve"> là bản đồ bố trí vật lý (Device View) sau quá trình Place &amp; Route. Các vệt sáng màu xanh cyan</w:t>
+      </w:r>
+      <w:r>
+        <w:rPr>
+          <w:rFonts w:ascii="Times New Roman" w:hAnsi="Times New Roman" w:cs="Times New Roman"/>
+        </w:rPr>
+        <w:t xml:space="preserve"> </w:t>
+      </w:r>
+      <w:r>
+        <w:rPr>
+          <w:rFonts w:ascii="Times New Roman" w:hAnsi="Times New Roman" w:cs="Times New Roman"/>
+        </w:rPr>
+        <w:t>chính là các cổng logic (CLB LUTs và Registers) của lõi gia tốc CNN và bộ DMA đã được đặt xuống mặt chip</w:t>
+      </w:r>
+      <w:r>
+        <w:rPr>
+          <w:rFonts w:ascii="Times New Roman" w:hAnsi="Times New Roman" w:cs="Times New Roman"/>
+        </w:rPr>
+        <w:t>.</w:t>
+      </w:r>
+    </w:p>
+    <w:p>
+      <w:pPr>
+        <w:rPr>
+          <w:rFonts w:ascii="Times New Roman" w:hAnsi="Times New Roman" w:cs="Times New Roman"/>
+        </w:rPr>
+      </w:pPr>
+      <w:r>
+        <w:rPr>
+          <w:rFonts w:ascii="Times New Roman" w:hAnsi="Times New Roman" w:cs="Times New Roman"/>
+        </w:rPr>
+        <w:t>+ C</w:t>
+      </w:r>
+      <w:r>
+        <w:rPr>
+          <w:rFonts w:ascii="Times New Roman" w:hAnsi="Times New Roman" w:cs="Times New Roman"/>
+        </w:rPr>
+        <w:t>ông cụ Placer của Vivado</w:t>
+      </w:r>
+      <w:r>
+        <w:rPr>
+          <w:rFonts w:ascii="Times New Roman" w:hAnsi="Times New Roman" w:cs="Times New Roman"/>
+        </w:rPr>
+        <w:t xml:space="preserve"> </w:t>
+      </w:r>
+      <w:r>
+        <w:rPr>
+          <w:rFonts w:ascii="Times New Roman" w:hAnsi="Times New Roman" w:cs="Times New Roman"/>
+        </w:rPr>
+        <w:t>không rải rác linh kiện khắp nơi, mà gom cụm toàn bộ thiết kế</w:t>
+      </w:r>
+      <w:r>
+        <w:rPr>
+          <w:rFonts w:ascii="Times New Roman" w:hAnsi="Times New Roman" w:cs="Times New Roman"/>
+        </w:rPr>
+        <w:t xml:space="preserve"> </w:t>
+      </w:r>
+      <w:r>
+        <w:rPr>
+          <w:rFonts w:ascii="Times New Roman" w:hAnsi="Times New Roman" w:cs="Times New Roman"/>
+        </w:rPr>
+        <w:t xml:space="preserve">vào một dải dọc thuộc các vùng xung nhịp (Clock Regions) </w:t>
+      </w:r>
+      <w:r>
+        <w:rPr>
+          <w:rFonts w:ascii="Times New Roman" w:hAnsi="Times New Roman" w:cs="Times New Roman"/>
+          <w:b/>
+          <w:bCs/>
+        </w:rPr>
+        <w:t xml:space="preserve">X1Y1, X1Y2, X1Y3 </w:t>
+      </w:r>
+      <w:r>
+        <w:rPr>
+          <w:rFonts w:ascii="Times New Roman" w:hAnsi="Times New Roman" w:cs="Times New Roman"/>
+        </w:rPr>
+        <w:t>và một phần</w:t>
+      </w:r>
+      <w:r>
+        <w:rPr>
+          <w:rFonts w:ascii="Times New Roman" w:hAnsi="Times New Roman" w:cs="Times New Roman"/>
+          <w:b/>
+          <w:bCs/>
+        </w:rPr>
+        <w:t xml:space="preserve"> X1Y4</w:t>
+      </w:r>
+      <w:r>
+        <w:rPr>
+          <w:rFonts w:ascii="Times New Roman" w:hAnsi="Times New Roman" w:cs="Times New Roman"/>
+        </w:rPr>
+        <w:t xml:space="preserve">. </w:t>
+      </w:r>
+      <w:r>
+        <w:rPr>
+          <w:rFonts w:ascii="Times New Roman" w:hAnsi="Times New Roman" w:cs="Times New Roman"/>
+        </w:rPr>
+        <w:t>Việc đặt các lớp mạng nơ-ron sát nhau như thế này giúp tối thiểu hóa chiều dài đường đi dây (Routing Delay) giữa các tầng</w:t>
+      </w:r>
+      <w:r>
+        <w:rPr>
+          <w:rFonts w:ascii="Times New Roman" w:hAnsi="Times New Roman" w:cs="Times New Roman"/>
+        </w:rPr>
+        <w:t>.</w:t>
+      </w:r>
+    </w:p>
+    <w:p>
+      <w:pPr>
+        <w:rPr>
+          <w:rFonts w:ascii="Times New Roman" w:hAnsi="Times New Roman" w:cs="Times New Roman"/>
+        </w:rPr>
+      </w:pPr>
+      <w:r>
+        <w:rPr>
+          <w:rFonts w:ascii="Times New Roman" w:hAnsi="Times New Roman" w:cs="Times New Roman"/>
+        </w:rPr>
+        <w:t>- Timing:</w:t>
+      </w:r>
+    </w:p>
+    <w:p>
+      <w:pPr>
+        <w:rPr>
+          <w:rFonts w:ascii="Times New Roman" w:hAnsi="Times New Roman" w:cs="Times New Roman"/>
+        </w:rPr>
+      </w:pPr>
+      <w:r>
+        <w:rPr>
+          <w:rFonts w:ascii="Times New Roman" w:hAnsi="Times New Roman" w:cs="Times New Roman"/>
+        </w:rPr>
+        <w:drawing>
+          <wp:inline distT="0" distB="0" distL="0" distR="0" wp14:anchorId="1D5A21D5" wp14:editId="63C97CDE">
+            <wp:extent cx="5943600" cy="1801495"/>
+            <wp:effectExtent l="0" t="0" r="0" b="8255"/>
+            <wp:docPr id="32713483" name="Picture 1"/>
+            <wp:cNvGraphicFramePr>
+              <a:graphicFrameLocks xmlns:a="http://schemas.openxmlformats.org/drawingml/2006/main" noChangeAspect="1"/>
+            </wp:cNvGraphicFramePr>
+            <a:graphic xmlns:a="http://schemas.openxmlformats.org/drawingml/2006/main">
+              <a:graphicData uri="http://schemas.openxmlformats.org/drawingml/2006/picture">
+                <pic:pic xmlns:pic="http://schemas.openxmlformats.org/drawingml/2006/picture">
+                  <pic:nvPicPr>
+                    <pic:cNvPr id="32713483" name=""/>
+                    <pic:cNvPicPr/>
+                  </pic:nvPicPr>
+                  <pic:blipFill>
+                    <a:blip r:embed="rId12"/>
+                    <a:stretch>
+                      <a:fillRect/>
+                    </a:stretch>
+                  </pic:blipFill>
+                  <pic:spPr>
+                    <a:xfrm>
+                      <a:off x="0" y="0"/>
+                      <a:ext cx="5943600" cy="1801495"/>
+                    </a:xfrm>
+                    <a:prstGeom prst="rect">
+                      <a:avLst/>
+                    </a:prstGeom>
+                  </pic:spPr>
+                </pic:pic>
+              </a:graphicData>
+            </a:graphic>
+          </wp:inline>
+        </w:drawing>
+      </w:r>
+    </w:p>
+    <w:p>
+      <w:pPr>
+        <w:rPr>
+          <w:rFonts w:ascii="Times New Roman" w:hAnsi="Times New Roman" w:cs="Times New Roman"/>
+        </w:rPr>
+      </w:pPr>
+      <w:r>
+        <w:rPr>
+          <w:rFonts w:ascii="Times New Roman" w:hAnsi="Times New Roman" w:cs="Times New Roman"/>
+        </w:rPr>
+        <w:t xml:space="preserve">+ </w:t>
+      </w:r>
+      <w:r>
+        <w:rPr>
+          <w:rFonts w:ascii="Times New Roman" w:hAnsi="Times New Roman" w:cs="Times New Roman"/>
+        </w:rPr>
+        <w:t>Hệ thống đáp ứng hoàn toàn 100% các ràng buộc về thời gian (All user specified timing constraints are met)</w:t>
+      </w:r>
+      <w:r>
+        <w:rPr>
+          <w:rFonts w:ascii="Times New Roman" w:hAnsi="Times New Roman" w:cs="Times New Roman"/>
+        </w:rPr>
+        <w:t>.</w:t>
+      </w:r>
+    </w:p>
+    <w:p>
+      <w:pPr>
+        <w:rPr>
+          <w:rFonts w:ascii="Times New Roman" w:hAnsi="Times New Roman" w:cs="Times New Roman"/>
+        </w:rPr>
+      </w:pPr>
+      <w:r>
+        <w:rPr>
+          <w:rFonts w:ascii="Times New Roman" w:hAnsi="Times New Roman" w:cs="Times New Roman"/>
+        </w:rPr>
+        <w:t xml:space="preserve">+ </w:t>
+      </w:r>
+      <w:r>
+        <w:rPr>
+          <w:rFonts w:ascii="Times New Roman" w:hAnsi="Times New Roman" w:cs="Times New Roman"/>
+        </w:rPr>
+        <w:t>WNS (Worst Negative Slack) = 4.419 ns</w:t>
+      </w:r>
+      <w:r>
+        <w:rPr>
+          <w:rFonts w:ascii="Times New Roman" w:hAnsi="Times New Roman" w:cs="Times New Roman"/>
+        </w:rPr>
+        <w:t xml:space="preserve">: </w:t>
+      </w:r>
+      <w:r>
+        <w:rPr>
+          <w:rFonts w:ascii="Times New Roman" w:hAnsi="Times New Roman" w:cs="Times New Roman"/>
+        </w:rPr>
+        <w:t>Nó cho thấy đường trễ tới hạn (critical path) trong hệ thống bộ nhớ và logic</w:t>
+      </w:r>
+      <w:r>
+        <w:rPr>
+          <w:rFonts w:ascii="Times New Roman" w:hAnsi="Times New Roman" w:cs="Times New Roman"/>
+        </w:rPr>
+        <w:t xml:space="preserve"> </w:t>
+      </w:r>
+      <w:r>
+        <w:rPr>
+          <w:rFonts w:ascii="Times New Roman" w:hAnsi="Times New Roman" w:cs="Times New Roman"/>
+        </w:rPr>
+        <w:t>không những kịp nhịp clock mà còn dư ra 4.419 ns</w:t>
+      </w:r>
+      <w:r>
+        <w:rPr>
+          <w:rFonts w:ascii="Times New Roman" w:hAnsi="Times New Roman" w:cs="Times New Roman"/>
+        </w:rPr>
+        <w:t>.</w:t>
+      </w:r>
+    </w:p>
+    <w:p>
+      <w:pPr>
+        <w:rPr>
+          <w:rFonts w:ascii="Times New Roman" w:hAnsi="Times New Roman" w:cs="Times New Roman"/>
+        </w:rPr>
+      </w:pPr>
+      <w:r>
+        <w:rPr>
+          <w:rFonts w:ascii="Times New Roman" w:hAnsi="Times New Roman" w:cs="Times New Roman"/>
+        </w:rPr>
+        <w:t xml:space="preserve">+ </w:t>
+      </w:r>
+      <w:r>
+        <w:rPr>
+          <w:rFonts w:ascii="Times New Roman" w:hAnsi="Times New Roman" w:cs="Times New Roman"/>
+        </w:rPr>
+        <w:t>WHS (Worst Hold Slack) = 0.010 ns</w:t>
+      </w:r>
+      <w:r>
+        <w:rPr>
+          <w:rFonts w:ascii="Times New Roman" w:hAnsi="Times New Roman" w:cs="Times New Roman"/>
+        </w:rPr>
+        <w:t xml:space="preserve">: </w:t>
+      </w:r>
+      <w:r>
+        <w:rPr>
+          <w:rFonts w:ascii="Times New Roman" w:hAnsi="Times New Roman" w:cs="Times New Roman"/>
+        </w:rPr>
+        <w:t>Đạt số dương, khẳng định không có vi phạm thời gian giữ (Hold time violation) ở bất kỳ thanh ghi nào</w:t>
+      </w:r>
+      <w:r>
+        <w:rPr>
+          <w:rFonts w:ascii="Times New Roman" w:hAnsi="Times New Roman" w:cs="Times New Roman"/>
+        </w:rPr>
+        <w:t>.</w:t>
+      </w:r>
+    </w:p>
+    <w:p>
+      <w:pPr>
+        <w:rPr>
+          <w:rFonts w:ascii="Times New Roman" w:hAnsi="Times New Roman" w:cs="Times New Roman"/>
+        </w:rPr>
+      </w:pPr>
+      <w:r>
+        <w:rPr>
+          <w:rFonts w:ascii="Times New Roman" w:hAnsi="Times New Roman" w:cs="Times New Roman"/>
+        </w:rPr>
+        <w:t xml:space="preserve">+ </w:t>
+      </w:r>
+      <w:r>
+        <w:rPr>
+          <w:rFonts w:ascii="Times New Roman" w:hAnsi="Times New Roman" w:cs="Times New Roman"/>
+        </w:rPr>
+        <w:t>Failing Endpoints = 0: Toàn bộ 39,551 điểm chốt dữ liệu (endpoints) đều hoạt động đồng bộ hoàn hảo</w:t>
+      </w:r>
+      <w:r>
+        <w:rPr>
+          <w:rFonts w:ascii="Times New Roman" w:hAnsi="Times New Roman" w:cs="Times New Roman"/>
+        </w:rPr>
+        <w:t>.</w:t>
+      </w:r>
+    </w:p>
+    <w:p>
+      <w:pPr>
+        <w:rPr>
+          <w:rFonts w:ascii="Times New Roman" w:hAnsi="Times New Roman" w:cs="Times New Roman"/>
+        </w:rPr>
+      </w:pPr>
+      <w:r>
+        <w:rPr>
+          <w:rFonts w:ascii="Times New Roman" w:hAnsi="Times New Roman" w:cs="Times New Roman"/>
+        </w:rPr>
+        <w:t xml:space="preserve">===&gt; </w:t>
+      </w:r>
+      <w:r>
+        <w:rPr>
+          <w:rFonts w:ascii="Times New Roman" w:hAnsi="Times New Roman" w:cs="Times New Roman"/>
+        </w:rPr>
+        <w:t>Với lượng Slack dương dồi dào (+4.419 ns), kiến trúc bộ nhớ (dùng LUT/FF cho CNN và BRAM cho DMA) không tạo ra bất kỳ "nút thắt cổ chai" nào về mặt định tuyến (routing</w:t>
+      </w:r>
+      <w:r>
+        <w:rPr>
+          <w:rFonts w:ascii="Times New Roman" w:hAnsi="Times New Roman" w:cs="Times New Roman"/>
+        </w:rPr>
+        <w:t>).</w:t>
+      </w:r>
+    </w:p>
+    <w:p>
+      <w:pPr>
+        <w:rPr>
+          <w:rFonts w:ascii="Times New Roman" w:hAnsi="Times New Roman" w:cs="Times New Roman"/>
+        </w:rPr>
+      </w:pPr>
+      <w:r>
+        <w:rPr>
+          <w:rFonts w:ascii="Times New Roman" w:hAnsi="Times New Roman" w:cs="Times New Roman"/>
+        </w:rPr>
+        <w:t>- Tài nguyên và kiến trúc bộ nhớ:</w:t>
+      </w:r>
+    </w:p>
+    <w:p>
+      <w:pPr>
+        <w:rPr>
+          <w:rFonts w:ascii="Times New Roman" w:hAnsi="Times New Roman" w:cs="Times New Roman"/>
+        </w:rPr>
+      </w:pPr>
+      <w:r>
+        <w:rPr>
+          <w:rFonts w:ascii="Times New Roman" w:hAnsi="Times New Roman" w:cs="Times New Roman"/>
+        </w:rPr>
+        <w:lastRenderedPageBreak/>
+        <w:drawing>
+          <wp:inline distT="0" distB="0" distL="0" distR="0" wp14:anchorId="7BD06055" wp14:editId="48FF8B3B">
+            <wp:extent cx="5943600" cy="1708150"/>
+            <wp:effectExtent l="0" t="0" r="0" b="6350"/>
+            <wp:docPr id="932711043" name="Picture 1"/>
+            <wp:cNvGraphicFramePr>
+              <a:graphicFrameLocks xmlns:a="http://schemas.openxmlformats.org/drawingml/2006/main" noChangeAspect="1"/>
+            </wp:cNvGraphicFramePr>
+            <a:graphic xmlns:a="http://schemas.openxmlformats.org/drawingml/2006/main">
+              <a:graphicData uri="http://schemas.openxmlformats.org/drawingml/2006/picture">
+                <pic:pic xmlns:pic="http://schemas.openxmlformats.org/drawingml/2006/picture">
+                  <pic:nvPicPr>
+                    <pic:cNvPr id="932711043" name=""/>
+                    <pic:cNvPicPr/>
+                  </pic:nvPicPr>
+                  <pic:blipFill>
+                    <a:blip r:embed="rId13"/>
+                    <a:stretch>
+                      <a:fillRect/>
+                    </a:stretch>
+                  </pic:blipFill>
+                  <pic:spPr>
+                    <a:xfrm>
+                      <a:off x="0" y="0"/>
+                      <a:ext cx="5943600" cy="1708150"/>
+                    </a:xfrm>
+                    <a:prstGeom prst="rect">
+                      <a:avLst/>
+                    </a:prstGeom>
+                  </pic:spPr>
+                </pic:pic>
+              </a:graphicData>
+            </a:graphic>
+          </wp:inline>
+        </w:drawing>
+      </w:r>
+    </w:p>
+    <w:p>
+      <w:pPr>
+        <w:rPr>
+          <w:rFonts w:ascii="Times New Roman" w:hAnsi="Times New Roman" w:cs="Times New Roman"/>
+        </w:rPr>
+      </w:pPr>
+      <w:r>
+        <w:rPr>
+          <w:rFonts w:ascii="Times New Roman" w:hAnsi="Times New Roman" w:cs="Times New Roman"/>
+        </w:rPr>
+        <w:t xml:space="preserve">+ Phân bổ BRAM: </w:t>
+      </w:r>
+      <w:r>
+        <w:rPr>
+          <w:rFonts w:ascii="Times New Roman" w:hAnsi="Times New Roman" w:cs="Times New Roman"/>
+        </w:rPr>
+        <w:t>Tổng hệ thống sử dụng rất ít BRAM (chỉ tốn 2 khối Block RAM Tile). Toàn bộ 2 khối BRAM này được công cụ phân bổ cho bộ</w:t>
+      </w:r>
+      <w:r>
+        <w:rPr>
+          <w:rFonts w:ascii="Times New Roman" w:hAnsi="Times New Roman" w:cs="Times New Roman"/>
+        </w:rPr>
+        <w:t xml:space="preserve"> </w:t>
+      </w:r>
+      <w:r>
+        <w:rPr>
+          <w:rFonts w:ascii="Times New Roman" w:hAnsi="Times New Roman" w:cs="Times New Roman"/>
+        </w:rPr>
+        <w:t>axi_dma_0</w:t>
+      </w:r>
+      <w:r>
+        <w:rPr>
+          <w:rFonts w:ascii="Times New Roman" w:hAnsi="Times New Roman" w:cs="Times New Roman"/>
+        </w:rPr>
+        <w:t xml:space="preserve"> </w:t>
+      </w:r>
+      <w:r>
+        <w:rPr>
+          <w:rFonts w:ascii="Times New Roman" w:hAnsi="Times New Roman" w:cs="Times New Roman"/>
+        </w:rPr>
+        <w:t>để làm các bộ đệm FIFO cỡ lớn chuyên trung chuyển ảnh</w:t>
+      </w:r>
+      <w:r>
+        <w:rPr>
+          <w:rFonts w:ascii="Times New Roman" w:hAnsi="Times New Roman" w:cs="Times New Roman"/>
+        </w:rPr>
+        <w:t>.</w:t>
+      </w:r>
+    </w:p>
+    <w:p>
+      <w:pPr>
+        <w:rPr>
+          <w:rFonts w:ascii="Times New Roman" w:hAnsi="Times New Roman" w:cs="Times New Roman"/>
+        </w:rPr>
+      </w:pPr>
+      <w:r>
+        <w:rPr>
+          <w:rFonts w:ascii="Times New Roman" w:hAnsi="Times New Roman" w:cs="Times New Roman"/>
+        </w:rPr>
+        <w:t xml:space="preserve">+ Kiến trúc CNN: </w:t>
+      </w:r>
+      <w:r>
+        <w:rPr>
+          <w:rFonts w:ascii="Times New Roman" w:hAnsi="Times New Roman" w:cs="Times New Roman"/>
+        </w:rPr>
+        <w:t>số lượng BRAM bằng 0 và LUT as Memory cũng bằng 0</w:t>
+      </w:r>
+      <w:r>
+        <w:rPr>
+          <w:rFonts w:ascii="Times New Roman" w:hAnsi="Times New Roman" w:cs="Times New Roman"/>
+        </w:rPr>
+        <w:t xml:space="preserve">. Thay </w:t>
+      </w:r>
+      <w:r>
+        <w:rPr>
+          <w:rFonts w:ascii="Times New Roman" w:hAnsi="Times New Roman" w:cs="Times New Roman"/>
+        </w:rPr>
+        <w:t>vào đó, nó tiêu thụ 1193 CLB LUTs (Logic) và 2059 CLB Registers (Flip-Flops)</w:t>
+      </w:r>
+      <w:r>
+        <w:rPr>
+          <w:rFonts w:ascii="Times New Roman" w:hAnsi="Times New Roman" w:cs="Times New Roman"/>
+        </w:rPr>
+        <w:t>.</w:t>
+      </w:r>
+    </w:p>
+    <w:p>
+      <w:pPr>
+        <w:rPr>
+          <w:rFonts w:ascii="Times New Roman" w:hAnsi="Times New Roman" w:cs="Times New Roman"/>
+        </w:rPr>
+      </w:pPr>
+      <w:r>
+        <w:rPr>
+          <w:rFonts w:ascii="Times New Roman" w:hAnsi="Times New Roman" w:cs="Times New Roman"/>
+        </w:rPr>
+        <w:t xml:space="preserve">+ </w:t>
+      </w:r>
+      <w:r>
+        <w:rPr>
+          <w:rFonts w:ascii="Times New Roman" w:hAnsi="Times New Roman" w:cs="Times New Roman"/>
+        </w:rPr>
+        <w:t>Kết luận:</w:t>
+      </w:r>
+    </w:p>
+    <w:p>
+      <w:pPr>
+        <w:rPr>
+          <w:rFonts w:ascii="Times New Roman" w:hAnsi="Times New Roman" w:cs="Times New Roman"/>
+        </w:rPr>
+      </w:pPr>
+      <w:r>
+        <w:rPr>
+          <w:rFonts w:ascii="Times New Roman" w:hAnsi="Times New Roman" w:cs="Times New Roman"/>
+        </w:rPr>
+        <w:t xml:space="preserve">* </w:t>
+      </w:r>
+      <w:r>
+        <w:rPr>
+          <w:rFonts w:ascii="Times New Roman" w:hAnsi="Times New Roman" w:cs="Times New Roman"/>
+        </w:rPr>
+        <w:t>Các luồng dữ liệu chuẩn AXI (SMC, DMA) được ưu tiên dùng BRAM và LUTRAM để xử lý khối lượng lớn (Burst mode)</w:t>
+      </w:r>
+      <w:r>
+        <w:rPr>
+          <w:rFonts w:ascii="Times New Roman" w:hAnsi="Times New Roman" w:cs="Times New Roman"/>
+        </w:rPr>
+        <w:t>.</w:t>
+      </w:r>
+    </w:p>
+    <w:p>
+      <w:pPr>
+        <w:rPr>
+          <w:rFonts w:ascii="Times New Roman" w:hAnsi="Times New Roman" w:cs="Times New Roman"/>
+        </w:rPr>
+      </w:pPr>
+      <w:r>
+        <w:rPr>
+          <w:rFonts w:ascii="Times New Roman" w:hAnsi="Times New Roman" w:cs="Times New Roman"/>
+        </w:rPr>
+        <w:t xml:space="preserve">* </w:t>
+      </w:r>
+      <w:r>
+        <w:rPr>
+          <w:rFonts w:ascii="Times New Roman" w:hAnsi="Times New Roman" w:cs="Times New Roman"/>
+        </w:rPr>
+        <w:t>Lõi CNN do đặc thù cần băng thông siêu rộng và đọc/ghi dữ liệu liên tục không đồng bộ (như ở flatten buffer hoặc lấy trọng số tính MAC), trình biên dịch đã biến mảng nhớ thành kiến trúc Register-based (sử dụng 2059 thanh ghi FF)</w:t>
+      </w:r>
+      <w:r>
+        <w:rPr>
+          <w:rFonts w:ascii="Times New Roman" w:hAnsi="Times New Roman" w:cs="Times New Roman"/>
+        </w:rPr>
+        <w:t xml:space="preserve">. </w:t>
+      </w:r>
+      <w:r>
+        <w:rPr>
+          <w:rFonts w:ascii="Times New Roman" w:hAnsi="Times New Roman" w:cs="Times New Roman"/>
+        </w:rPr>
+        <w:t>Sự đánh đổi này tốn thêm một chút diện tích logic (CLB) nhưng đổi lại mang đến tốc độ truy xuất dữ liệu chỉ trong 1 chu kỳ máy (1 clock cycle), góp phần tạo ra WNS dương rất lớn như đã thấy ở bảng Timing</w:t>
+      </w:r>
+      <w:r>
+        <w:rPr>
+          <w:rFonts w:ascii="Times New Roman" w:hAnsi="Times New Roman" w:cs="Times New Roman"/>
+        </w:rPr>
+        <w:t>.</w:t>
+      </w:r>
+    </w:p>
+    <w:p>
+      <w:pPr>
+        <w:rPr>
+          <w:rFonts w:ascii="Times New Roman" w:hAnsi="Times New Roman" w:cs="Times New Roman"/>
+        </w:rPr>
+      </w:pPr>
+      <w:r>
+        <w:rPr>
+          <w:rFonts w:ascii="Times New Roman" w:hAnsi="Times New Roman" w:cs="Times New Roman"/>
+        </w:rPr>
+        <w:t>- Power:</w:t>
+      </w:r>
+      <w:r>
+        <w:rPr>
+          <w:rFonts w:ascii="Times New Roman" w:hAnsi="Times New Roman" w:cs="Times New Roman"/>
+        </w:rPr>
+        <w:drawing>
+          <wp:inline distT="0" distB="0" distL="0" distR="0" wp14:anchorId="4C01E58D" wp14:editId="74291D12">
+            <wp:extent cx="5943600" cy="1819275"/>
+            <wp:effectExtent l="0" t="0" r="0" b="9525"/>
+            <wp:docPr id="894509207" name="Picture 1"/>
+            <wp:cNvGraphicFramePr>
+              <a:graphicFrameLocks xmlns:a="http://schemas.openxmlformats.org/drawingml/2006/main" noChangeAspect="1"/>
+            </wp:cNvGraphicFramePr>
+            <a:graphic xmlns:a="http://schemas.openxmlformats.org/drawingml/2006/main">
+              <a:graphicData uri="http://schemas.openxmlformats.org/drawingml/2006/picture">
+                <pic:pic xmlns:pic="http://schemas.openxmlformats.org/drawingml/2006/picture">
+                  <pic:nvPicPr>
+                    <pic:cNvPr id="894509207" name=""/>
+                    <pic:cNvPicPr/>
+                  </pic:nvPicPr>
+                  <pic:blipFill>
+                    <a:blip r:embed="rId14"/>
+                    <a:stretch>
+                      <a:fillRect/>
+                    </a:stretch>
+                  </pic:blipFill>
+                  <pic:spPr>
+                    <a:xfrm>
+                      <a:off x="0" y="0"/>
+                      <a:ext cx="5943600" cy="1819275"/>
+                    </a:xfrm>
+                    <a:prstGeom prst="rect">
+                      <a:avLst/>
+                    </a:prstGeom>
+                  </pic:spPr>
+                </pic:pic>
+              </a:graphicData>
+            </a:graphic>
+          </wp:inline>
+        </w:drawing>
+      </w:r>
+    </w:p>
+    <w:p>
+      <w:pPr>
+        <w:rPr>
+          <w:rFonts w:ascii="Times New Roman" w:hAnsi="Times New Roman" w:cs="Times New Roman"/>
+        </w:rPr>
+      </w:pPr>
+      <w:r>
+        <w:rPr>
+          <w:rFonts w:ascii="Times New Roman" w:hAnsi="Times New Roman" w:cs="Times New Roman"/>
+        </w:rPr>
+        <w:t xml:space="preserve">+ </w:t>
+      </w:r>
+      <w:r>
+        <w:rPr>
+          <w:rFonts w:ascii="Times New Roman" w:hAnsi="Times New Roman" w:cs="Times New Roman"/>
+        </w:rPr>
+        <w:t>Tổng công suất tiêu thụ trên chip (Total On-Chip Power) là 3.437 W. Trong đó, công suất động (Dynamic) chiếm 80% (2.745 W) và công suất tĩnh (Static/Leakage) chiếm 20% (0.692 W)</w:t>
+      </w:r>
+      <w:r>
+        <w:rPr>
+          <w:rFonts w:ascii="Times New Roman" w:hAnsi="Times New Roman" w:cs="Times New Roman"/>
+        </w:rPr>
+        <w:t>.</w:t>
+      </w:r>
+    </w:p>
+    <w:p>
+      <w:pPr>
+        <w:rPr>
+          <w:rFonts w:ascii="Times New Roman" w:hAnsi="Times New Roman" w:cs="Times New Roman"/>
+        </w:rPr>
+      </w:pPr>
+      <w:r>
+        <w:rPr>
+          <w:rFonts w:ascii="Times New Roman" w:hAnsi="Times New Roman" w:cs="Times New Roman"/>
+        </w:rPr>
+        <w:t xml:space="preserve">+ </w:t>
+      </w:r>
+      <w:r>
+        <w:rPr>
+          <w:rFonts w:ascii="Times New Roman" w:hAnsi="Times New Roman" w:cs="Times New Roman"/>
+        </w:rPr>
+        <w:t>Nhìn vào biểu đồ cột Dynamic Power</w:t>
+      </w:r>
+      <w:r>
+        <w:rPr>
+          <w:rFonts w:ascii="Times New Roman" w:hAnsi="Times New Roman" w:cs="Times New Roman"/>
+        </w:rPr>
+        <w:t>:</w:t>
+      </w:r>
+    </w:p>
+    <w:p>
+      <w:pPr>
+        <w:rPr>
+          <w:rFonts w:ascii="Times New Roman" w:hAnsi="Times New Roman" w:cs="Times New Roman"/>
+        </w:rPr>
+      </w:pPr>
+      <w:r>
+        <w:rPr>
+          <w:rFonts w:ascii="Times New Roman" w:hAnsi="Times New Roman" w:cs="Times New Roman"/>
+        </w:rPr>
+        <w:lastRenderedPageBreak/>
+        <w:t xml:space="preserve">* </w:t>
+      </w:r>
+      <w:r>
+        <w:rPr>
+          <w:rFonts w:ascii="Times New Roman" w:hAnsi="Times New Roman" w:cs="Times New Roman"/>
+        </w:rPr>
+        <w:t>Hệ thống vi xử lý ARM (PS - Processing System) là nhân tố "ngốn" điện chính, chiếm tới 95% (2.643 W) công suất động</w:t>
+      </w:r>
+      <w:r>
+        <w:rPr>
+          <w:rFonts w:ascii="Times New Roman" w:hAnsi="Times New Roman" w:cs="Times New Roman"/>
+        </w:rPr>
+        <w:t>.</w:t>
+      </w:r>
+    </w:p>
+    <w:p>
+      <w:pPr>
+        <w:rPr>
+          <w:rFonts w:ascii="Times New Roman" w:hAnsi="Times New Roman" w:cs="Times New Roman"/>
+        </w:rPr>
+      </w:pPr>
+      <w:r>
+        <w:rPr>
+          <w:rFonts w:ascii="Times New Roman" w:hAnsi="Times New Roman" w:cs="Times New Roman"/>
+        </w:rPr>
+        <w:t xml:space="preserve">* </w:t>
+      </w:r>
+      <w:r>
+        <w:rPr>
+          <w:rFonts w:ascii="Times New Roman" w:hAnsi="Times New Roman" w:cs="Times New Roman"/>
+        </w:rPr>
+        <w:t>Trong khi đó, toàn bộ phần lõi cứng máy học CNN, bộ nhớ DMA, SMC nằm dưới mảng khả trình (PL - Programmable Logic) chỉ tiêu tốn một lượng điện năng cực kỳ khiêm tốn: Logic tốn 0.045 W (2%) và BRAM tốn &lt;0.001 W (&lt;1%)</w:t>
+      </w:r>
+      <w:r>
+        <w:rPr>
+          <w:rFonts w:ascii="Times New Roman" w:hAnsi="Times New Roman" w:cs="Times New Roman"/>
+        </w:rPr>
+        <w:t>.</w:t>
+      </w:r>
+    </w:p>
+    <w:p>
+      <w:pPr>
+        <w:rPr>
+          <w:rFonts w:ascii="Times New Roman" w:hAnsi="Times New Roman" w:cs="Times New Roman"/>
+        </w:rPr>
+      </w:pPr>
+      <w:r>
+        <w:rPr>
+          <w:rFonts w:ascii="Times New Roman" w:hAnsi="Times New Roman" w:cs="Times New Roman"/>
+        </w:rPr>
+        <w:t xml:space="preserve">==&gt; </w:t>
+      </w:r>
+      <w:r>
+        <w:rPr>
+          <w:rFonts w:ascii="Times New Roman" w:hAnsi="Times New Roman" w:cs="Times New Roman"/>
+        </w:rPr>
+        <w:t>Khối tăng tốc phần cứng CNN (Hardware Accelerator) được thiết kế vô cùng tiết kiệm năng lượng. Kiến trúc lưu trữ trọng số và bộ đệm trung gian tuy sử dụng thanh ghi cục bộ nhưng không hề gây hiện tượng hao phí điện năng (Dynamic Power cho logic cực thấp). Điều này chứng minh kiến trúc bộ nhớ được thiết kế cực kỳ hiệu quả, phù hợp cho các thiết bị Edge AI</w:t>
+      </w:r>
+      <w:r>
+        <w:rPr>
+          <w:rFonts w:ascii="Times New Roman" w:hAnsi="Times New Roman" w:cs="Times New Roman"/>
+        </w:rPr>
+        <w:t>.</w:t>
+      </w:r>
+    </w:p>
+    <w:p>
+      <w:pPr>
+        <w:rPr>
+          <w:rFonts w:ascii="Times New Roman" w:hAnsi="Times New Roman" w:cs="Times New Roman"/>
+        </w:rPr>
+      </w:pPr>
+      <w:r>
+        <w:rPr>
+          <w:rFonts w:ascii="Times New Roman" w:hAnsi="Times New Roman" w:cs="Times New Roman"/>
+        </w:rPr>
+        <w:t>- Đánh giá hiệu năng của phân hệ thống:</w:t>
+      </w:r>
+    </w:p>
+    <w:p>
+      <w:pPr>
+        <w:rPr>
+          <w:rFonts w:ascii="Times New Roman" w:hAnsi="Times New Roman" w:cs="Times New Roman"/>
+        </w:rPr>
+      </w:pPr>
+      <w:r>
+        <w:rPr>
+          <w:rFonts w:ascii="Times New Roman" w:hAnsi="Times New Roman" w:cs="Times New Roman"/>
+        </w:rPr>
+        <w:t xml:space="preserve">+ </w:t>
+      </w:r>
+      <w:r>
+        <w:rPr>
+          <w:rFonts w:ascii="Times New Roman" w:hAnsi="Times New Roman" w:cs="Times New Roman"/>
+        </w:rPr>
+        <w:t>Hiệu quả sử dụng BRAM/URAM</w:t>
+      </w:r>
+      <w:r>
+        <w:rPr>
+          <w:rFonts w:ascii="Times New Roman" w:hAnsi="Times New Roman" w:cs="Times New Roman"/>
+        </w:rPr>
+        <w:t>:</w:t>
+      </w:r>
+    </w:p>
+    <w:p>
+      <w:pPr>
+        <w:rPr>
+          <w:rFonts w:ascii="Times New Roman" w:hAnsi="Times New Roman" w:cs="Times New Roman"/>
+        </w:rPr>
+      </w:pPr>
+      <w:r>
+        <w:rPr>
+          <w:rFonts w:ascii="Times New Roman" w:hAnsi="Times New Roman" w:cs="Times New Roman"/>
+        </w:rPr>
+        <w:t xml:space="preserve">* </w:t>
+      </w:r>
+      <w:r>
+        <w:rPr>
+          <w:rFonts w:ascii="Times New Roman" w:hAnsi="Times New Roman" w:cs="Times New Roman"/>
+        </w:rPr>
+        <w:t>Khối DMA</w:t>
+      </w:r>
+      <w:r>
+        <w:rPr>
+          <w:rFonts w:ascii="Times New Roman" w:hAnsi="Times New Roman" w:cs="Times New Roman"/>
+        </w:rPr>
+        <w:t xml:space="preserve"> </w:t>
+      </w:r>
+      <w:r>
+        <w:rPr>
+          <w:rFonts w:ascii="Times New Roman" w:hAnsi="Times New Roman" w:cs="Times New Roman"/>
+        </w:rPr>
+        <w:t>có nhiệm vụ trung chuyển khối lượng dữ liệu lớn (burst transfer), nên công cụ đã cấp phát 2 khối BRAM Tile (RAMB36E2) để làm FIFO đệm. Điều này cực kỳ hiệu quả vì BRAM chuyên trị các mảng nhớ đồng bộ lớn</w:t>
+      </w:r>
+      <w:r>
+        <w:rPr>
+          <w:rFonts w:ascii="Times New Roman" w:hAnsi="Times New Roman" w:cs="Times New Roman"/>
+        </w:rPr>
+        <w:t>.</w:t>
+      </w:r>
+    </w:p>
+    <w:p>
+      <w:pPr>
+        <w:rPr>
+          <w:rFonts w:ascii="Times New Roman" w:hAnsi="Times New Roman" w:cs="Times New Roman"/>
+        </w:rPr>
+      </w:pPr>
+      <w:r>
+        <w:rPr>
+          <w:rFonts w:ascii="Times New Roman" w:hAnsi="Times New Roman" w:cs="Times New Roman"/>
+        </w:rPr>
+        <w:t xml:space="preserve">* </w:t>
+      </w:r>
+      <w:r>
+        <w:rPr>
+          <w:rFonts w:ascii="Times New Roman" w:hAnsi="Times New Roman" w:cs="Times New Roman"/>
+        </w:rPr>
+        <w:t>Ngược lại, bên trong lõi CNN</w:t>
+      </w:r>
+      <w:r>
+        <w:rPr>
+          <w:rFonts w:ascii="Times New Roman" w:hAnsi="Times New Roman" w:cs="Times New Roman"/>
+        </w:rPr>
+        <w:t xml:space="preserve">, </w:t>
+      </w:r>
+      <w:r>
+        <w:rPr>
+          <w:rFonts w:ascii="Times New Roman" w:hAnsi="Times New Roman" w:cs="Times New Roman"/>
+        </w:rPr>
+        <w:t>vì mạng LeNet-5 có kích thước trọng số nhỏ và yêu cầu đọc dữ liệu song song/không đồng bộ</w:t>
+      </w:r>
+      <w:r>
+        <w:rPr>
+          <w:rFonts w:ascii="Times New Roman" w:hAnsi="Times New Roman" w:cs="Times New Roman"/>
+        </w:rPr>
+        <w:t xml:space="preserve">, </w:t>
+      </w:r>
+      <w:r>
+        <w:rPr>
+          <w:rFonts w:ascii="Times New Roman" w:hAnsi="Times New Roman" w:cs="Times New Roman"/>
+        </w:rPr>
+        <w:t>hệ thống hoàn toàn không dùng BRAM hay URAM, mà sử dụng 2059 thanh ghi (Registers/FF)</w:t>
+      </w:r>
+      <w:r>
+        <w:rPr>
+          <w:rFonts w:ascii="Times New Roman" w:hAnsi="Times New Roman" w:cs="Times New Roman"/>
+        </w:rPr>
+        <w:t>.</w:t>
+      </w:r>
+    </w:p>
+    <w:p>
+      <w:pPr>
+        <w:rPr>
+          <w:rFonts w:ascii="Times New Roman" w:hAnsi="Times New Roman" w:cs="Times New Roman"/>
+        </w:rPr>
+      </w:pPr>
+      <w:r>
+        <w:rPr>
+          <w:rFonts w:ascii="Times New Roman" w:hAnsi="Times New Roman" w:cs="Times New Roman"/>
+        </w:rPr>
+        <w:t xml:space="preserve">* Kết luận: </w:t>
+      </w:r>
+      <w:r>
+        <w:rPr>
+          <w:rFonts w:ascii="Times New Roman" w:hAnsi="Times New Roman" w:cs="Times New Roman"/>
+        </w:rPr>
+        <w:t>Kiến trúc này cho thấy hiệu quả cao: Không lãng phí các khối BRAM 18K/36K khổng lồ cho những mảng dữ liệu lẻ tẻ, dành BRAM cho các ngoại vi cần thiết hơn (như DMA), đồng thời tận dụng lượng dồi dào Flip-Flop của chip Zynq để tăng tốc xử lý</w:t>
+      </w:r>
+      <w:r>
+        <w:rPr>
+          <w:rFonts w:ascii="Times New Roman" w:hAnsi="Times New Roman" w:cs="Times New Roman"/>
+        </w:rPr>
+        <w:t>.</w:t>
+      </w:r>
+    </w:p>
+    <w:p>
+      <w:pPr>
+        <w:rPr>
+          <w:rFonts w:ascii="Times New Roman" w:hAnsi="Times New Roman" w:cs="Times New Roman"/>
+        </w:rPr>
+      </w:pPr>
+      <w:r>
+        <w:rPr>
+          <w:rFonts w:ascii="Times New Roman" w:hAnsi="Times New Roman" w:cs="Times New Roman"/>
+        </w:rPr>
+        <w:t xml:space="preserve">+ </w:t>
+      </w:r>
+      <w:r>
+        <w:rPr>
+          <w:rFonts w:ascii="Times New Roman" w:hAnsi="Times New Roman" w:cs="Times New Roman"/>
+        </w:rPr>
+        <w:t>Mức sử dụng tài nguyên FPGA</w:t>
+      </w:r>
+      <w:r>
+        <w:rPr>
+          <w:rFonts w:ascii="Times New Roman" w:hAnsi="Times New Roman" w:cs="Times New Roman"/>
+        </w:rPr>
+        <w:t>:</w:t>
+      </w:r>
+    </w:p>
+    <w:p>
+      <w:pPr>
+        <w:rPr>
+          <w:rFonts w:ascii="Times New Roman" w:hAnsi="Times New Roman" w:cs="Times New Roman"/>
+        </w:rPr>
+      </w:pPr>
+      <w:r>
+        <w:rPr>
+          <w:rFonts w:ascii="Times New Roman" w:hAnsi="Times New Roman" w:cs="Times New Roman"/>
+        </w:rPr>
+        <w:t xml:space="preserve">* </w:t>
+      </w:r>
+      <w:r>
+        <w:rPr>
+          <w:rFonts w:ascii="Times New Roman" w:hAnsi="Times New Roman" w:cs="Times New Roman"/>
+        </w:rPr>
+        <w:t>Lõi gia tốc CNN tiêu thụ 1193 CLB LUTs, 2059 CLB Registers và 0 BRAM/DSP (nếu các phép nhân được tổng hợp thành logic). Tổng toàn hệ thống (bao gồm cả DMA và SMC) tiêu thụ 7706 LUTs và 11589 Registers</w:t>
+      </w:r>
+      <w:r>
+        <w:rPr>
+          <w:rFonts w:ascii="Times New Roman" w:hAnsi="Times New Roman" w:cs="Times New Roman"/>
+        </w:rPr>
+        <w:t>.</w:t>
+      </w:r>
+    </w:p>
+    <w:p>
+      <w:pPr>
+        <w:rPr>
+          <w:rFonts w:ascii="Times New Roman" w:hAnsi="Times New Roman" w:cs="Times New Roman"/>
+        </w:rPr>
+      </w:pPr>
+      <w:r>
+        <w:rPr>
+          <w:rFonts w:ascii="Times New Roman" w:hAnsi="Times New Roman" w:cs="Times New Roman"/>
+        </w:rPr>
+        <w:t xml:space="preserve">* Kết luận: </w:t>
+      </w:r>
+      <w:r>
+        <w:rPr>
+          <w:rFonts w:ascii="Times New Roman" w:hAnsi="Times New Roman" w:cs="Times New Roman"/>
+        </w:rPr>
+        <w:t>Thiết kế cực kỳ gọn nhẹ (lightweight), tiết kiệm diện tích phần cứng (Area-optimized). Với mức tài nguyên này, kiến trúc vi mạch hoàn toàn đủ khả năng triển khai thực tế trên các bo mạch FPGA cấu hình thấp</w:t>
+      </w:r>
+      <w:r>
+        <w:rPr>
+          <w:rFonts w:ascii="Times New Roman" w:hAnsi="Times New Roman" w:cs="Times New Roman"/>
+        </w:rPr>
+        <w:t xml:space="preserve"> </w:t>
+      </w:r>
+      <w:r>
+        <w:rPr>
+          <w:rFonts w:ascii="Times New Roman" w:hAnsi="Times New Roman" w:cs="Times New Roman"/>
+        </w:rPr>
+        <w:t>phục vụ cho các ứng dụng Edge AI hoặc IoT mà vẫn đảm bảo được hiệu năng xử lý mong muốn</w:t>
+      </w:r>
+      <w:r>
+        <w:rPr>
+          <w:rFonts w:ascii="Times New Roman" w:hAnsi="Times New Roman" w:cs="Times New Roman"/>
+        </w:rPr>
+        <w:t>.</w:t>
+      </w:r>
+    </w:p>
+    <w:p>
+      <w:pPr>
+        <w:rPr>
+          <w:rFonts w:ascii="Times New Roman" w:hAnsi="Times New Roman" w:cs="Times New Roman"/>
+        </w:rPr>
+      </w:pPr>
+      <w:r>
+        <w:rPr>
+          <w:rFonts w:ascii="Times New Roman" w:hAnsi="Times New Roman" w:cs="Times New Roman"/>
+        </w:rPr>
+        <w:t xml:space="preserve">- </w:t>
+      </w:r>
+      <w:r>
+        <w:rPr>
+          <w:rFonts w:ascii="Times New Roman" w:hAnsi="Times New Roman" w:cs="Times New Roman"/>
+        </w:rPr>
+        <w:t>Đánh giá Khả năng cung cấp dữ liệu liên tục</w:t>
+      </w:r>
+      <w:r>
+        <w:rPr>
+          <w:rFonts w:ascii="Times New Roman" w:hAnsi="Times New Roman" w:cs="Times New Roman"/>
+        </w:rPr>
+        <w:t xml:space="preserve">: </w:t>
+      </w:r>
+    </w:p>
+    <w:p>
+      <w:pPr>
+        <w:rPr>
+          <w:rFonts w:ascii="Times New Roman" w:hAnsi="Times New Roman" w:cs="Times New Roman"/>
+        </w:rPr>
+      </w:pPr>
+      <w:r>
+        <w:rPr>
+          <w:rFonts w:ascii="Times New Roman" w:hAnsi="Times New Roman" w:cs="Times New Roman"/>
+        </w:rPr>
+        <w:lastRenderedPageBreak/>
+        <w:drawing>
+          <wp:inline distT="0" distB="0" distL="0" distR="0" wp14:anchorId="6516C695" wp14:editId="423D94A7">
+            <wp:extent cx="5943600" cy="2566670"/>
+            <wp:effectExtent l="0" t="0" r="0" b="5080"/>
+            <wp:docPr id="866190308" name="Picture 1"/>
+            <wp:cNvGraphicFramePr>
+              <a:graphicFrameLocks xmlns:a="http://schemas.openxmlformats.org/drawingml/2006/main" noChangeAspect="1"/>
+            </wp:cNvGraphicFramePr>
+            <a:graphic xmlns:a="http://schemas.openxmlformats.org/drawingml/2006/main">
+              <a:graphicData uri="http://schemas.openxmlformats.org/drawingml/2006/picture">
+                <pic:pic xmlns:pic="http://schemas.openxmlformats.org/drawingml/2006/picture">
+                  <pic:nvPicPr>
+                    <pic:cNvPr id="866190308" name=""/>
+                    <pic:cNvPicPr/>
+                  </pic:nvPicPr>
+                  <pic:blipFill>
+                    <a:blip r:embed="rId15"/>
+                    <a:stretch>
+                      <a:fillRect/>
+                    </a:stretch>
+                  </pic:blipFill>
+                  <pic:spPr>
+                    <a:xfrm>
+                      <a:off x="0" y="0"/>
+                      <a:ext cx="5943600" cy="2566670"/>
+                    </a:xfrm>
+                    <a:prstGeom prst="rect">
+                      <a:avLst/>
+                    </a:prstGeom>
+                  </pic:spPr>
+                </pic:pic>
+              </a:graphicData>
+            </a:graphic>
+          </wp:inline>
+        </w:drawing>
+      </w:r>
+    </w:p>
+    <w:p>
+      <w:pPr>
+        <w:rPr>
+          <w:rFonts w:ascii="Times New Roman" w:hAnsi="Times New Roman" w:cs="Times New Roman"/>
+        </w:rPr>
+      </w:pPr>
+      <w:r>
+        <w:rPr>
+          <w:rFonts w:ascii="Times New Roman" w:hAnsi="Times New Roman" w:cs="Times New Roman"/>
+        </w:rPr>
+        <w:t xml:space="preserve">+ Kịch bản kiểm thử: Bơm </w:t>
+      </w:r>
+      <w:r>
+        <w:rPr>
+          <w:rFonts w:ascii="Times New Roman" w:hAnsi="Times New Roman" w:cs="Times New Roman"/>
+        </w:rPr>
+        <w:t>liên tục 784 bytes dữ liệu ảnh vào lõi IP thông qua giao thức AXI4-Stream.</w:t>
+      </w:r>
+    </w:p>
+    <w:p>
+      <w:pPr>
+        <w:rPr>
+          <w:rFonts w:ascii="Times New Roman" w:hAnsi="Times New Roman" w:cs="Times New Roman"/>
+        </w:rPr>
+      </w:pPr>
+      <w:r>
+        <w:rPr>
+          <w:rFonts w:ascii="Times New Roman" w:hAnsi="Times New Roman" w:cs="Times New Roman"/>
+        </w:rPr>
+        <w:t xml:space="preserve">+ Quan sát trên waveform, </w:t>
+      </w:r>
+      <w:r>
+        <w:rPr>
+          <w:rFonts w:ascii="Times New Roman" w:hAnsi="Times New Roman" w:cs="Times New Roman"/>
+        </w:rPr>
+        <w:t>trong suốt quá trình tín hiệu</w:t>
+      </w:r>
+      <w:r>
+        <w:rPr>
+          <w:rFonts w:ascii="Times New Roman" w:hAnsi="Times New Roman" w:cs="Times New Roman"/>
+        </w:rPr>
+        <w:t xml:space="preserve"> s_axis_tvalid được </w:t>
+      </w:r>
+      <w:r>
+        <w:rPr>
+          <w:rFonts w:ascii="Times New Roman" w:hAnsi="Times New Roman" w:cs="Times New Roman"/>
+        </w:rPr>
+        <w:t>giữ ở mức logic</w:t>
+      </w:r>
+      <w:r>
+        <w:rPr>
+          <w:rFonts w:ascii="Times New Roman" w:hAnsi="Times New Roman" w:cs="Times New Roman"/>
+        </w:rPr>
+        <w:t xml:space="preserve"> 1, tín hiệu phản hồi s_axis_tready từ khối phần cứng luôn duy trì ổn định ở mức 1. Biến giám sát </w:t>
+      </w:r>
+      <w:r>
+        <w:rPr>
+          <w:rFonts w:ascii="Times New Roman" w:hAnsi="Times New Roman" w:cs="Times New Roman"/>
+        </w:rPr>
+        <w:t>backpressure_stalls báo giá trị tuyệt đối bằng</w:t>
+      </w:r>
+      <w:r>
+        <w:rPr>
+          <w:rFonts w:ascii="Times New Roman" w:hAnsi="Times New Roman" w:cs="Times New Roman"/>
+        </w:rPr>
+        <w:t xml:space="preserve"> 0.</w:t>
+      </w:r>
+    </w:p>
+    <w:p>
+      <w:pPr>
+        <w:rPr>
+          <w:rFonts w:ascii="Times New Roman" w:hAnsi="Times New Roman" w:cs="Times New Roman"/>
+        </w:rPr>
+      </w:pPr>
+      <w:r>
+        <w:rPr>
+          <w:rFonts w:ascii="Times New Roman" w:hAnsi="Times New Roman" w:cs="Times New Roman"/>
+        </w:rPr>
+        <w:t xml:space="preserve">==&gt; </w:t>
+      </w:r>
+      <w:r>
+        <w:rPr>
+          <w:rFonts w:ascii="Times New Roman" w:hAnsi="Times New Roman" w:cs="Times New Roman"/>
+        </w:rPr>
+        <w:t>Kiến trúc bộ đệm ngõ vào (Line Buffer) của phân hệ Tích chập (Convolution) được thiết kế với độ sâu cực kỳ tối ưu</w:t>
+      </w:r>
+      <w:r>
+        <w:rPr>
+          <w:rFonts w:ascii="Times New Roman" w:hAnsi="Times New Roman" w:cs="Times New Roman"/>
+        </w:rPr>
+        <w:t xml:space="preserve">. </w:t>
+      </w:r>
+      <w:r>
+        <w:rPr>
+          <w:rFonts w:ascii="Times New Roman" w:hAnsi="Times New Roman" w:cs="Times New Roman"/>
+        </w:rPr>
+        <w:t>Hệ thống có khả năng 'tiêu thụ' dữ liệu liên tục với thông lượng 1 byte/chu kỳ xung nhịp (1 byte/clock cycle) mà không sinh ra bất kỳ trạng thái chờ (Wait-state) nào ngược lại cho bộ DMA. Điều này đảm bảo đường ống xử lý (Pipeline) hoạt động với công suất 100% không bị đứt gãy</w:t>
+      </w:r>
+      <w:r>
+        <w:rPr>
+          <w:rFonts w:ascii="Times New Roman" w:hAnsi="Times New Roman" w:cs="Times New Roman"/>
+        </w:rPr>
+        <w:t>.</w:t>
+      </w:r>
+    </w:p>
+    <w:p>
+      <w:pPr>
+        <w:rPr>
+          <w:rFonts w:ascii="Times New Roman" w:hAnsi="Times New Roman" w:cs="Times New Roman"/>
+        </w:rPr>
+      </w:pPr>
+      <w:r>
+        <w:rPr>
+          <w:rFonts w:ascii="Times New Roman" w:hAnsi="Times New Roman" w:cs="Times New Roman"/>
+        </w:rPr>
+        <w:t xml:space="preserve">- </w:t>
+      </w:r>
+      <w:r>
+        <w:rPr>
+          <w:rFonts w:ascii="Times New Roman" w:hAnsi="Times New Roman" w:cs="Times New Roman"/>
+        </w:rPr>
+        <w:t>Đánh giá Độ trễ xử lý và Truy xuất bộ nhớ (Processing &amp; Memory Access Latency)</w:t>
+      </w:r>
+      <w:r>
+        <w:rPr>
+          <w:rFonts w:ascii="Times New Roman" w:hAnsi="Times New Roman" w:cs="Times New Roman"/>
+        </w:rPr>
+        <w:t>:</w:t>
+      </w:r>
+    </w:p>
+    <w:p>
+      <w:pPr>
+        <w:rPr>
+          <w:rFonts w:ascii="Times New Roman" w:hAnsi="Times New Roman" w:cs="Times New Roman"/>
+        </w:rPr>
+      </w:pPr>
+      <w:r>
+        <w:rPr>
+          <w:rFonts w:ascii="Times New Roman" w:hAnsi="Times New Roman" w:cs="Times New Roman"/>
+        </w:rPr>
+        <w:drawing>
+          <wp:inline distT="0" distB="0" distL="0" distR="0" wp14:anchorId="6A868F26" wp14:editId="2C523F6F">
+            <wp:extent cx="5943600" cy="2434590"/>
+            <wp:effectExtent l="0" t="0" r="0" b="3810"/>
+            <wp:docPr id="1865694807" name="Picture 1"/>
+            <wp:cNvGraphicFramePr>
+              <a:graphicFrameLocks xmlns:a="http://schemas.openxmlformats.org/drawingml/2006/main" noChangeAspect="1"/>
+            </wp:cNvGraphicFramePr>
+            <a:graphic xmlns:a="http://schemas.openxmlformats.org/drawingml/2006/main">
+              <a:graphicData uri="http://schemas.openxmlformats.org/drawingml/2006/picture">
+                <pic:pic xmlns:pic="http://schemas.openxmlformats.org/drawingml/2006/picture">
+                  <pic:nvPicPr>
+                    <pic:cNvPr id="1865694807" name=""/>
+                    <pic:cNvPicPr/>
+                  </pic:nvPicPr>
+                  <pic:blipFill>
+                    <a:blip r:embed="rId16"/>
+                    <a:stretch>
+                      <a:fillRect/>
+                    </a:stretch>
+                  </pic:blipFill>
+                  <pic:spPr>
+                    <a:xfrm>
+                      <a:off x="0" y="0"/>
+                      <a:ext cx="5943600" cy="2434590"/>
+                    </a:xfrm>
+                    <a:prstGeom prst="rect">
+                      <a:avLst/>
+                    </a:prstGeom>
+                  </pic:spPr>
+                </pic:pic>
+              </a:graphicData>
+            </a:graphic>
+          </wp:inline>
+        </w:drawing>
+      </w:r>
+    </w:p>
+    <w:p>
+      <w:pPr>
+        <w:rPr>
+          <w:rFonts w:ascii="Times New Roman" w:hAnsi="Times New Roman" w:cs="Times New Roman"/>
+        </w:rPr>
+      </w:pPr>
+      <w:r>
+        <w:rPr>
+          <w:rFonts w:ascii="Times New Roman" w:hAnsi="Times New Roman" w:cs="Times New Roman"/>
+        </w:rPr>
+        <w:lastRenderedPageBreak/>
+        <w:t xml:space="preserve">+ </w:t>
+      </w:r>
+      <w:r>
+        <w:rPr>
+          <w:rFonts w:ascii="Times New Roman" w:hAnsi="Times New Roman" w:cs="Times New Roman"/>
+        </w:rPr>
+        <w:t>Tổng số dữ liệu đã nạp: 784 bytes:</w:t>
+      </w:r>
+      <w:r>
+        <w:rPr>
+          <w:rFonts w:ascii="Times New Roman" w:hAnsi="Times New Roman" w:cs="Times New Roman"/>
+        </w:rPr>
+        <w:t xml:space="preserve"> </w:t>
+      </w:r>
+      <w:r>
+        <w:rPr>
+          <w:rFonts w:ascii="Times New Roman" w:hAnsi="Times New Roman" w:cs="Times New Roman"/>
+        </w:rPr>
+        <w:t>Tương ứng với bức ảnh kích thước 28x28 pixel. Khối testbench đã bơm trọn vẹn bức ảnh này vào mạch</w:t>
+      </w:r>
+      <w:r>
+        <w:rPr>
+          <w:rFonts w:ascii="Times New Roman" w:hAnsi="Times New Roman" w:cs="Times New Roman"/>
+        </w:rPr>
+        <w:t>.</w:t>
+      </w:r>
+    </w:p>
+    <w:p>
+      <w:pPr>
+        <w:rPr>
+          <w:rFonts w:ascii="Times New Roman" w:hAnsi="Times New Roman" w:cs="Times New Roman"/>
+        </w:rPr>
+      </w:pPr>
+      <w:r>
+        <w:rPr>
+          <w:rFonts w:ascii="Times New Roman" w:hAnsi="Times New Roman" w:cs="Times New Roman"/>
+        </w:rPr>
+        <w:t xml:space="preserve">+ </w:t>
+      </w:r>
+      <w:r>
+        <w:rPr>
+          <w:rFonts w:ascii="Times New Roman" w:hAnsi="Times New Roman" w:cs="Times New Roman"/>
+        </w:rPr>
+        <w:t>Số chu kỳ bị nghẽn: 0 chu kỳ (stalls)</w:t>
+      </w:r>
+      <w:r>
+        <w:rPr>
+          <w:rFonts w:ascii="Times New Roman" w:hAnsi="Times New Roman" w:cs="Times New Roman"/>
+        </w:rPr>
+        <w:t xml:space="preserve">: Mỗi </w:t>
+      </w:r>
+      <w:r>
+        <w:rPr>
+          <w:rFonts w:ascii="Times New Roman" w:hAnsi="Times New Roman" w:cs="Times New Roman"/>
+        </w:rPr>
+        <w:t xml:space="preserve">khi Testbench đẩy </w:t>
+      </w:r>
+      <w:proofErr w:type="gramStart"/>
+      <w:r>
+        <w:rPr>
+          <w:rFonts w:ascii="Times New Roman" w:hAnsi="Times New Roman" w:cs="Times New Roman"/>
+        </w:rPr>
+        <w:t>1 pixel</w:t>
+      </w:r>
+      <w:proofErr w:type="gramEnd"/>
+      <w:r>
+        <w:rPr>
+          <w:rFonts w:ascii="Times New Roman" w:hAnsi="Times New Roman" w:cs="Times New Roman"/>
+        </w:rPr>
+        <w:t xml:space="preserve"> vào (tvalid = 1), khối CNN</w:t>
+      </w:r>
+      <w:r>
+        <w:rPr>
+          <w:rFonts w:ascii="Times New Roman" w:hAnsi="Times New Roman" w:cs="Times New Roman"/>
+        </w:rPr>
+        <w:t xml:space="preserve"> </w:t>
+      </w:r>
+      <w:r>
+        <w:rPr>
+          <w:rFonts w:ascii="Times New Roman" w:hAnsi="Times New Roman" w:cs="Times New Roman"/>
+        </w:rPr>
+        <w:t>ngay lập tức mở cửa đón nhận (tready = 1) mà không hề bắt Testbench phải đứng đợi một nhịp clock nào</w:t>
+      </w:r>
+      <w:r>
+        <w:rPr>
+          <w:rFonts w:ascii="Times New Roman" w:hAnsi="Times New Roman" w:cs="Times New Roman"/>
+        </w:rPr>
+        <w:t>.</w:t>
+      </w:r>
+    </w:p>
+    <w:p>
+      <w:pPr>
+        <w:rPr>
+          <w:rFonts w:ascii="Times New Roman" w:hAnsi="Times New Roman" w:cs="Times New Roman"/>
+        </w:rPr>
+      </w:pPr>
+      <w:r>
+        <w:rPr>
+          <w:rFonts w:ascii="Times New Roman" w:hAnsi="Times New Roman" w:cs="Times New Roman"/>
+        </w:rPr>
+        <w:t xml:space="preserve">==&gt; </w:t>
+      </w:r>
+      <w:r>
+        <w:rPr>
+          <w:rFonts w:ascii="Times New Roman" w:hAnsi="Times New Roman" w:cs="Times New Roman"/>
+        </w:rPr>
+        <w:t>Bộ đệm (Buffer) ngõ vào đủ lớn nên không xảy ra hiện tượng Backpressure (dội ngược dữ liệu làm tắc nghẽn luồng AXI-Stream)</w:t>
+      </w:r>
+      <w:r>
+        <w:rPr>
+          <w:rFonts w:ascii="Times New Roman" w:hAnsi="Times New Roman" w:cs="Times New Roman"/>
+        </w:rPr>
+        <w:t>.</w:t>
+      </w:r>
+    </w:p>
+    <w:p>
+      <w:pPr>
+        <w:rPr>
+          <w:rFonts w:ascii="Times New Roman" w:hAnsi="Times New Roman" w:cs="Times New Roman"/>
+        </w:rPr>
+      </w:pPr>
+      <w:r>
+        <w:rPr>
+          <w:rFonts w:ascii="Times New Roman" w:hAnsi="Times New Roman" w:cs="Times New Roman"/>
+        </w:rPr>
+        <w:t xml:space="preserve">+ </w:t>
+      </w:r>
+      <w:r>
+        <w:rPr>
+          <w:rFonts w:ascii="Times New Roman" w:hAnsi="Times New Roman" w:cs="Times New Roman"/>
+        </w:rPr>
+        <w:t>TỔNG ĐỘ TRỄ (LATENCY): 647005 ns:</w:t>
+      </w:r>
+      <w:r>
+        <w:rPr>
+          <w:rFonts w:ascii="Times New Roman" w:hAnsi="Times New Roman" w:cs="Times New Roman"/>
+        </w:rPr>
+        <w:t xml:space="preserve"> Mạch </w:t>
+      </w:r>
+      <w:r>
+        <w:rPr>
+          <w:rFonts w:ascii="Times New Roman" w:hAnsi="Times New Roman" w:cs="Times New Roman"/>
+        </w:rPr>
+        <w:t>mất đúng 647 micro-giây (chưa tới 1 mili-giây) để tính toán xong toàn bộ thuật toán nhận diện ảnh</w:t>
+      </w:r>
+      <w:r>
+        <w:rPr>
+          <w:rFonts w:ascii="Times New Roman" w:hAnsi="Times New Roman" w:cs="Times New Roman"/>
+        </w:rPr>
+        <w:t>.</w:t>
+      </w:r>
+    </w:p>
+    <w:p>
+      <w:pPr>
+        <w:rPr>
+          <w:rFonts w:ascii="Times New Roman" w:hAnsi="Times New Roman" w:cs="Times New Roman"/>
+        </w:rPr>
+      </w:pPr>
+      <w:r>
+        <w:rPr>
+          <w:rFonts w:ascii="Times New Roman" w:hAnsi="Times New Roman" w:cs="Times New Roman"/>
+        </w:rPr>
+        <w:t xml:space="preserve">+ </w:t>
+      </w:r>
+      <w:r>
+        <w:rPr>
+          <w:rFonts w:ascii="Times New Roman" w:hAnsi="Times New Roman" w:cs="Times New Roman"/>
+        </w:rPr>
+        <w:t>TƯƠNG ĐƯƠNG: 64700 chu kỳ Clock</w:t>
+      </w:r>
+      <w:r>
+        <w:rPr>
+          <w:rFonts w:ascii="Times New Roman" w:hAnsi="Times New Roman" w:cs="Times New Roman"/>
+        </w:rPr>
+        <w:t xml:space="preserve">: </w:t>
+      </w:r>
+      <w:r>
+        <w:rPr>
+          <w:rFonts w:ascii="Times New Roman" w:hAnsi="Times New Roman" w:cs="Times New Roman"/>
+        </w:rPr>
+        <w:t>Kể từ lúc pixel đầu tiên rơi vào mạch cho đến khi kết quả chữ cái chui ra, hệ thống đã tốn đúng 64.700 nhịp đập của xung clock</w:t>
+      </w:r>
+      <w:r>
+        <w:rPr>
+          <w:rFonts w:ascii="Times New Roman" w:hAnsi="Times New Roman" w:cs="Times New Roman"/>
+        </w:rPr>
+        <w:t>.</w:t>
+      </w:r>
+    </w:p>
+    <w:p>
+      <w:pPr>
+        <w:rPr>
+          <w:rFonts w:ascii="Times New Roman" w:hAnsi="Times New Roman" w:cs="Times New Roman"/>
+        </w:rPr>
+      </w:pPr>
+      <w:r>
+        <w:rPr>
+          <w:rFonts w:ascii="Times New Roman" w:hAnsi="Times New Roman" w:cs="Times New Roman"/>
+        </w:rPr>
+        <w:t>==&gt; Đánh giá độ trễ xử lý và truy xuất bộ nhớ:</w:t>
+      </w:r>
+    </w:p>
+    <w:p>
+      <w:pPr>
+        <w:rPr>
+          <w:rFonts w:ascii="Times New Roman" w:hAnsi="Times New Roman" w:cs="Times New Roman"/>
+        </w:rPr>
+      </w:pPr>
+      <w:r>
+        <w:rPr>
+          <w:rFonts w:ascii="Times New Roman" w:hAnsi="Times New Roman" w:cs="Times New Roman"/>
+        </w:rPr>
+        <w:t xml:space="preserve">+ </w:t>
+      </w:r>
+      <w:r>
+        <w:rPr>
+          <w:rFonts w:ascii="Times New Roman" w:hAnsi="Times New Roman" w:cs="Times New Roman"/>
+        </w:rPr>
+        <w:t>Kết quả mô phỏng (Simulation) cho thấy toàn bộ hệ thống mất 647.005 ns, tương đương với đúng 64.700 chu kỳ xung nhịp (Clock cycles) để hoàn thành việc nhận diện một khung ảnh hoàn chỉnh</w:t>
+      </w:r>
+      <w:r>
+        <w:rPr>
+          <w:rFonts w:ascii="Times New Roman" w:hAnsi="Times New Roman" w:cs="Times New Roman"/>
+        </w:rPr>
+        <w:t>.</w:t>
+      </w:r>
+    </w:p>
+    <w:p>
+      <w:pPr>
+        <w:rPr>
+          <w:rFonts w:ascii="Times New Roman" w:hAnsi="Times New Roman" w:cs="Times New Roman"/>
+        </w:rPr>
+      </w:pPr>
+      <w:r>
+        <w:rPr>
+          <w:rFonts w:ascii="Times New Roman" w:hAnsi="Times New Roman" w:cs="Times New Roman"/>
+        </w:rPr>
+        <w:t xml:space="preserve">+ Con số này </w:t>
+      </w:r>
+      <w:r>
+        <w:rPr>
+          <w:rFonts w:ascii="Times New Roman" w:hAnsi="Times New Roman" w:cs="Times New Roman"/>
+        </w:rPr>
+        <w:t>chứng minh hiệu quả vượt trội của phương pháp thiết kế bộ nhớ phân tán</w:t>
+      </w:r>
+      <w:r>
+        <w:rPr>
+          <w:rFonts w:ascii="Times New Roman" w:hAnsi="Times New Roman" w:cs="Times New Roman"/>
+        </w:rPr>
+        <w:t xml:space="preserve">. Thay vì lưu trọng số </w:t>
+      </w:r>
+      <w:r>
+        <w:rPr>
+          <w:rFonts w:ascii="Times New Roman" w:hAnsi="Times New Roman" w:cs="Times New Roman"/>
+        </w:rPr>
+        <w:t>và Bias trên khối RAM vật lý bên ngoài và truy xuất qua Bus hệ thống</w:t>
+      </w:r>
+      <w:r>
+        <w:rPr>
+          <w:rFonts w:ascii="Times New Roman" w:hAnsi="Times New Roman" w:cs="Times New Roman"/>
+        </w:rPr>
+        <w:t xml:space="preserve">, </w:t>
+      </w:r>
+      <w:r>
+        <w:rPr>
+          <w:rFonts w:ascii="Times New Roman" w:hAnsi="Times New Roman" w:cs="Times New Roman"/>
+        </w:rPr>
+        <w:t>trình tổng hợp đã ánh xạ hệ số của mạng LeNet-5 trực tiếp vào các mảng thanh ghi cục bộ</w:t>
+      </w:r>
+      <w:r>
+        <w:rPr>
+          <w:rFonts w:ascii="Times New Roman" w:hAnsi="Times New Roman" w:cs="Times New Roman"/>
+        </w:rPr>
+        <w:t xml:space="preserve">. Nhờ </w:t>
+      </w:r>
+      <w:r>
+        <w:rPr>
+          <w:rFonts w:ascii="Times New Roman" w:hAnsi="Times New Roman" w:cs="Times New Roman"/>
+        </w:rPr>
+        <w:t>tiêu tối đa độ trễ truy cập bộ nhớ</w:t>
+      </w:r>
+      <w:r>
+        <w:rPr>
+          <w:rFonts w:ascii="Times New Roman" w:hAnsi="Times New Roman" w:cs="Times New Roman"/>
+        </w:rPr>
+        <w:t xml:space="preserve">, </w:t>
+      </w:r>
+      <w:r>
+        <w:rPr>
+          <w:rFonts w:ascii="Times New Roman" w:hAnsi="Times New Roman" w:cs="Times New Roman"/>
+        </w:rPr>
+        <w:t>phân hệ phần cứng đạt được thời gian phản hồi lý tưởng cho các ứng dụng AI tại biê</w:t>
+      </w:r>
+      <w:r>
+        <w:rPr>
+          <w:rFonts w:ascii="Times New Roman" w:hAnsi="Times New Roman" w:cs="Times New Roman"/>
+        </w:rPr>
+        <w:t>n.</w:t>
+      </w:r>
+    </w:p>
+    <w:p>
+      <w:pPr>
+        <w:rPr>
+          <w:rFonts w:ascii="Times New Roman" w:hAnsi="Times New Roman" w:cs="Times New Roman"/>
         </w:rPr>
       </w:pPr>
     </w:p>

</xml_diff>